<commit_message>
Update SQL documentation and add COALESCE guide
Updated several SQL-related DOCX files with new content and revisions. Added a new document, COALESCE.docx, providing guidance on the COALESCE SQL function.
</commit_message>
<xml_diff>
--- a/100_logical_QA.docx
+++ b/100_logical_QA.docx
@@ -18,7 +18,7 @@
       </w:pPr>
       <w:r>
         <w:rPr>
-          <w:rFonts w:ascii="Cambria" w:eastAsia="Times New Roman" w:hAnsi="Cambria" w:cs="Cambria"/>
+          <w:rFonts w:ascii="Times New Roman" w:eastAsia="Times New Roman" w:hAnsi="Times New Roman" w:cs="Times New Roman"/>
           <w:b/>
           <w:bCs/>
           <w:kern w:val="36"/>
@@ -26,19 +26,7 @@
           <w:szCs w:val="48"/>
           <w:lang w:eastAsia="en-IN"/>
         </w:rPr>
-        <w:t>🧠</w:t>
-      </w:r>
-      <w:r>
-        <w:rPr>
-          <w:rFonts w:ascii="Times New Roman" w:eastAsia="Times New Roman" w:hAnsi="Times New Roman" w:cs="Times New Roman"/>
-          <w:b/>
-          <w:bCs/>
-          <w:kern w:val="36"/>
-          <w:sz w:val="48"/>
-          <w:szCs w:val="48"/>
-          <w:lang w:eastAsia="en-IN"/>
-        </w:rPr>
-        <w:t xml:space="preserve"> 100 LOGICAL SQL QUESTIONS &amp; ANSWERS</w:t>
+        <w:t>100 LOGICAL SQL QUESTIONS &amp; ANSWERS</w:t>
       </w:r>
     </w:p>
     <w:p>
@@ -107,7 +95,7 @@
           <w:szCs w:val="36"/>
           <w:lang w:eastAsia="en-IN"/>
         </w:rPr>
-        <w:t>🟢 SECTION 1: AGGREGATES &amp; GROUP BY (Q1–Q25)</w:t>
+        <w:t>SECTION 1: AGGREGATES &amp; GROUP BY (Q1–Q25)</w:t>
       </w:r>
     </w:p>
     <w:p>
@@ -176,8 +164,21 @@
           <w:szCs w:val="24"/>
           <w:lang w:eastAsia="en-IN"/>
         </w:rPr>
-        <w:t>Answer:</w:t>
-      </w:r>
+        <w:t>Answer</w:t>
+      </w:r>
+      <w:proofErr w:type="gramStart"/>
+      <w:r>
+        <w:rPr>
+          <w:rFonts w:ascii="Times New Roman" w:eastAsia="Times New Roman" w:hAnsi="Times New Roman" w:cs="Times New Roman"/>
+          <w:b/>
+          <w:bCs/>
+          <w:sz w:val="24"/>
+          <w:szCs w:val="24"/>
+          <w:lang w:eastAsia="en-IN"/>
+        </w:rPr>
+        <w:t>:</w:t>
+      </w:r>
+      <w:proofErr w:type="gramEnd"/>
       <w:r>
         <w:rPr>
           <w:rFonts w:ascii="Times New Roman" w:eastAsia="Times New Roman" w:hAnsi="Times New Roman" w:cs="Times New Roman"/>
@@ -216,7 +217,26 @@
           <w:lang w:eastAsia="en-IN"/>
         </w:rPr>
         <w:br/>
-        <w:t xml:space="preserve">If you aggregate the entire table (e.g., COUNT(*)), SQL treats the whole table as </w:t>
+        <w:t xml:space="preserve">If you aggregate the entire table </w:t>
+      </w:r>
+      <w:r>
+        <w:rPr>
+          <w:rFonts w:ascii="Times New Roman" w:eastAsia="Times New Roman" w:hAnsi="Times New Roman" w:cs="Times New Roman"/>
+          <w:noProof/>
+          <w:sz w:val="24"/>
+          <w:szCs w:val="24"/>
+          <w:lang w:eastAsia="en-IN"/>
+        </w:rPr>
+        <w:t>(e.g., COUNT(*)),</w:t>
+      </w:r>
+      <w:r>
+        <w:rPr>
+          <w:rFonts w:ascii="Times New Roman" w:eastAsia="Times New Roman" w:hAnsi="Times New Roman" w:cs="Times New Roman"/>
+          <w:sz w:val="24"/>
+          <w:szCs w:val="24"/>
+          <w:lang w:eastAsia="en-IN"/>
+        </w:rPr>
+        <w:t xml:space="preserve"> SQL treats the whole table as </w:t>
       </w:r>
       <w:r>
         <w:rPr>
@@ -321,40 +341,9 @@
           <w:szCs w:val="20"/>
           <w:lang w:eastAsia="en-IN"/>
         </w:rPr>
-        <w:t>SELECT department, COUNT(*) FROM employees;</w:t>
-      </w:r>
-    </w:p>
-    <w:p>
-      <w:pPr>
-        <w:spacing w:before="100" w:beforeAutospacing="1" w:after="100" w:afterAutospacing="1" w:line="240" w:lineRule="auto"/>
-        <w:rPr>
-          <w:rFonts w:ascii="Times New Roman" w:eastAsia="Times New Roman" w:hAnsi="Times New Roman" w:cs="Times New Roman"/>
-          <w:sz w:val="24"/>
-          <w:szCs w:val="24"/>
-          <w:lang w:eastAsia="en-IN"/>
-        </w:rPr>
-      </w:pPr>
-      <w:r>
-        <w:rPr>
-          <w:rFonts w:ascii="Times New Roman" w:eastAsia="Times New Roman" w:hAnsi="Times New Roman" w:cs="Times New Roman"/>
-          <w:b/>
-          <w:bCs/>
-          <w:sz w:val="24"/>
-          <w:szCs w:val="24"/>
-          <w:lang w:eastAsia="en-IN"/>
-        </w:rPr>
-        <w:t>Answer:</w:t>
-      </w:r>
-      <w:r>
-        <w:rPr>
-          <w:rFonts w:ascii="Times New Roman" w:eastAsia="Times New Roman" w:hAnsi="Times New Roman" w:cs="Times New Roman"/>
-          <w:sz w:val="24"/>
-          <w:szCs w:val="24"/>
-          <w:lang w:eastAsia="en-IN"/>
-        </w:rPr>
-        <w:br/>
-        <w:t xml:space="preserve">Because </w:t>
-      </w:r>
+        <w:t xml:space="preserve">SELECT department, </w:t>
+      </w:r>
+      <w:proofErr w:type="gramStart"/>
       <w:r>
         <w:rPr>
           <w:rFonts w:ascii="Courier New" w:eastAsia="Times New Roman" w:hAnsi="Courier New" w:cs="Courier New"/>
@@ -362,6 +351,70 @@
           <w:szCs w:val="20"/>
           <w:lang w:eastAsia="en-IN"/>
         </w:rPr>
+        <w:t>COUNT(</w:t>
+      </w:r>
+      <w:proofErr w:type="gramEnd"/>
+      <w:r>
+        <w:rPr>
+          <w:rFonts w:ascii="Courier New" w:eastAsia="Times New Roman" w:hAnsi="Courier New" w:cs="Courier New"/>
+          <w:sz w:val="20"/>
+          <w:szCs w:val="20"/>
+          <w:lang w:eastAsia="en-IN"/>
+        </w:rPr>
+        <w:t>*) FROM employees;</w:t>
+      </w:r>
+    </w:p>
+    <w:p>
+      <w:pPr>
+        <w:spacing w:before="100" w:beforeAutospacing="1" w:after="100" w:afterAutospacing="1" w:line="240" w:lineRule="auto"/>
+        <w:rPr>
+          <w:rFonts w:ascii="Times New Roman" w:eastAsia="Times New Roman" w:hAnsi="Times New Roman" w:cs="Times New Roman"/>
+          <w:sz w:val="24"/>
+          <w:szCs w:val="24"/>
+          <w:lang w:eastAsia="en-IN"/>
+        </w:rPr>
+      </w:pPr>
+      <w:r>
+        <w:rPr>
+          <w:rFonts w:ascii="Times New Roman" w:eastAsia="Times New Roman" w:hAnsi="Times New Roman" w:cs="Times New Roman"/>
+          <w:b/>
+          <w:bCs/>
+          <w:sz w:val="24"/>
+          <w:szCs w:val="24"/>
+          <w:lang w:eastAsia="en-IN"/>
+        </w:rPr>
+        <w:t>Answer</w:t>
+      </w:r>
+      <w:proofErr w:type="gramStart"/>
+      <w:r>
+        <w:rPr>
+          <w:rFonts w:ascii="Times New Roman" w:eastAsia="Times New Roman" w:hAnsi="Times New Roman" w:cs="Times New Roman"/>
+          <w:b/>
+          <w:bCs/>
+          <w:sz w:val="24"/>
+          <w:szCs w:val="24"/>
+          <w:lang w:eastAsia="en-IN"/>
+        </w:rPr>
+        <w:t>:</w:t>
+      </w:r>
+      <w:proofErr w:type="gramEnd"/>
+      <w:r>
+        <w:rPr>
+          <w:rFonts w:ascii="Times New Roman" w:eastAsia="Times New Roman" w:hAnsi="Times New Roman" w:cs="Times New Roman"/>
+          <w:sz w:val="24"/>
+          <w:szCs w:val="24"/>
+          <w:lang w:eastAsia="en-IN"/>
+        </w:rPr>
+        <w:br/>
+        <w:t xml:space="preserve">Because </w:t>
+      </w:r>
+      <w:r>
+        <w:rPr>
+          <w:rFonts w:ascii="Courier New" w:eastAsia="Times New Roman" w:hAnsi="Courier New" w:cs="Courier New"/>
+          <w:sz w:val="20"/>
+          <w:szCs w:val="20"/>
+          <w:lang w:eastAsia="en-IN"/>
+        </w:rPr>
         <w:t>department</w:t>
       </w:r>
       <w:r>
@@ -460,8 +513,21 @@
           <w:szCs w:val="24"/>
           <w:lang w:eastAsia="en-IN"/>
         </w:rPr>
-        <w:t>Answer:</w:t>
-      </w:r>
+        <w:t>Answer</w:t>
+      </w:r>
+      <w:proofErr w:type="gramStart"/>
+      <w:r>
+        <w:rPr>
+          <w:rFonts w:ascii="Times New Roman" w:eastAsia="Times New Roman" w:hAnsi="Times New Roman" w:cs="Times New Roman"/>
+          <w:b/>
+          <w:bCs/>
+          <w:sz w:val="24"/>
+          <w:szCs w:val="24"/>
+          <w:lang w:eastAsia="en-IN"/>
+        </w:rPr>
+        <w:t>:</w:t>
+      </w:r>
+      <w:proofErr w:type="gramEnd"/>
       <w:r>
         <w:rPr>
           <w:rFonts w:ascii="Times New Roman" w:eastAsia="Times New Roman" w:hAnsi="Times New Roman" w:cs="Times New Roman"/>
@@ -559,8 +625,21 @@
           <w:szCs w:val="24"/>
           <w:lang w:eastAsia="en-IN"/>
         </w:rPr>
-        <w:t>Answer:</w:t>
-      </w:r>
+        <w:t>Answer</w:t>
+      </w:r>
+      <w:proofErr w:type="gramStart"/>
+      <w:r>
+        <w:rPr>
+          <w:rFonts w:ascii="Times New Roman" w:eastAsia="Times New Roman" w:hAnsi="Times New Roman" w:cs="Times New Roman"/>
+          <w:b/>
+          <w:bCs/>
+          <w:sz w:val="24"/>
+          <w:szCs w:val="24"/>
+          <w:lang w:eastAsia="en-IN"/>
+        </w:rPr>
+        <w:t>:</w:t>
+      </w:r>
+      <w:proofErr w:type="gramEnd"/>
       <w:r>
         <w:rPr>
           <w:rFonts w:ascii="Times New Roman" w:eastAsia="Times New Roman" w:hAnsi="Times New Roman" w:cs="Times New Roman"/>
@@ -659,8 +738,21 @@
           <w:lang w:eastAsia="en-IN"/>
         </w:rPr>
         <w:lastRenderedPageBreak/>
-        <w:t>Answer:</w:t>
-      </w:r>
+        <w:t>Answer</w:t>
+      </w:r>
+      <w:proofErr w:type="gramStart"/>
+      <w:r>
+        <w:rPr>
+          <w:rFonts w:ascii="Times New Roman" w:eastAsia="Times New Roman" w:hAnsi="Times New Roman" w:cs="Times New Roman"/>
+          <w:b/>
+          <w:bCs/>
+          <w:sz w:val="24"/>
+          <w:szCs w:val="24"/>
+          <w:lang w:eastAsia="en-IN"/>
+        </w:rPr>
+        <w:t>:</w:t>
+      </w:r>
+      <w:proofErr w:type="gramEnd"/>
       <w:r>
         <w:rPr>
           <w:rFonts w:ascii="Times New Roman" w:eastAsia="Times New Roman" w:hAnsi="Times New Roman" w:cs="Times New Roman"/>
@@ -758,8 +850,21 @@
           <w:szCs w:val="24"/>
           <w:lang w:eastAsia="en-IN"/>
         </w:rPr>
-        <w:t>Answer:</w:t>
-      </w:r>
+        <w:t>Answer</w:t>
+      </w:r>
+      <w:proofErr w:type="gramStart"/>
+      <w:r>
+        <w:rPr>
+          <w:rFonts w:ascii="Times New Roman" w:eastAsia="Times New Roman" w:hAnsi="Times New Roman" w:cs="Times New Roman"/>
+          <w:b/>
+          <w:bCs/>
+          <w:sz w:val="24"/>
+          <w:szCs w:val="24"/>
+          <w:lang w:eastAsia="en-IN"/>
+        </w:rPr>
+        <w:t>:</w:t>
+      </w:r>
+      <w:proofErr w:type="gramEnd"/>
       <w:r>
         <w:rPr>
           <w:rFonts w:ascii="Times New Roman" w:eastAsia="Times New Roman" w:hAnsi="Times New Roman" w:cs="Times New Roman"/>
@@ -857,8 +962,21 @@
           <w:szCs w:val="24"/>
           <w:lang w:eastAsia="en-IN"/>
         </w:rPr>
-        <w:t>Answer:</w:t>
-      </w:r>
+        <w:t>Answer</w:t>
+      </w:r>
+      <w:proofErr w:type="gramStart"/>
+      <w:r>
+        <w:rPr>
+          <w:rFonts w:ascii="Times New Roman" w:eastAsia="Times New Roman" w:hAnsi="Times New Roman" w:cs="Times New Roman"/>
+          <w:b/>
+          <w:bCs/>
+          <w:sz w:val="24"/>
+          <w:szCs w:val="24"/>
+          <w:lang w:eastAsia="en-IN"/>
+        </w:rPr>
+        <w:t>:</w:t>
+      </w:r>
+      <w:proofErr w:type="gramEnd"/>
       <w:r>
         <w:rPr>
           <w:rFonts w:ascii="Times New Roman" w:eastAsia="Times New Roman" w:hAnsi="Times New Roman" w:cs="Times New Roman"/>
@@ -936,8 +1054,21 @@
           <w:szCs w:val="24"/>
           <w:lang w:eastAsia="en-IN"/>
         </w:rPr>
-        <w:t>Answer:</w:t>
-      </w:r>
+        <w:t>Answer</w:t>
+      </w:r>
+      <w:proofErr w:type="gramStart"/>
+      <w:r>
+        <w:rPr>
+          <w:rFonts w:ascii="Times New Roman" w:eastAsia="Times New Roman" w:hAnsi="Times New Roman" w:cs="Times New Roman"/>
+          <w:b/>
+          <w:bCs/>
+          <w:sz w:val="24"/>
+          <w:szCs w:val="24"/>
+          <w:lang w:eastAsia="en-IN"/>
+        </w:rPr>
+        <w:t>:</w:t>
+      </w:r>
+      <w:proofErr w:type="gramEnd"/>
       <w:r>
         <w:rPr>
           <w:rFonts w:ascii="Times New Roman" w:eastAsia="Times New Roman" w:hAnsi="Times New Roman" w:cs="Times New Roman"/>
@@ -1015,8 +1146,21 @@
           <w:szCs w:val="24"/>
           <w:lang w:eastAsia="en-IN"/>
         </w:rPr>
-        <w:t>Answer:</w:t>
-      </w:r>
+        <w:t>Answer</w:t>
+      </w:r>
+      <w:proofErr w:type="gramStart"/>
+      <w:r>
+        <w:rPr>
+          <w:rFonts w:ascii="Times New Roman" w:eastAsia="Times New Roman" w:hAnsi="Times New Roman" w:cs="Times New Roman"/>
+          <w:b/>
+          <w:bCs/>
+          <w:sz w:val="24"/>
+          <w:szCs w:val="24"/>
+          <w:lang w:eastAsia="en-IN"/>
+        </w:rPr>
+        <w:t>:</w:t>
+      </w:r>
+      <w:proofErr w:type="gramEnd"/>
       <w:r>
         <w:rPr>
           <w:rFonts w:ascii="Times New Roman" w:eastAsia="Times New Roman" w:hAnsi="Times New Roman" w:cs="Times New Roman"/>
@@ -1094,8 +1238,21 @@
           <w:szCs w:val="24"/>
           <w:lang w:eastAsia="en-IN"/>
         </w:rPr>
-        <w:t>Answer:</w:t>
-      </w:r>
+        <w:t>Answer</w:t>
+      </w:r>
+      <w:proofErr w:type="gramStart"/>
+      <w:r>
+        <w:rPr>
+          <w:rFonts w:ascii="Times New Roman" w:eastAsia="Times New Roman" w:hAnsi="Times New Roman" w:cs="Times New Roman"/>
+          <w:b/>
+          <w:bCs/>
+          <w:sz w:val="24"/>
+          <w:szCs w:val="24"/>
+          <w:lang w:eastAsia="en-IN"/>
+        </w:rPr>
+        <w:t>:</w:t>
+      </w:r>
+      <w:proofErr w:type="gramEnd"/>
       <w:r>
         <w:rPr>
           <w:rFonts w:ascii="Times New Roman" w:eastAsia="Times New Roman" w:hAnsi="Times New Roman" w:cs="Times New Roman"/>
@@ -1151,30 +1308,67 @@
           <w:szCs w:val="27"/>
           <w:lang w:eastAsia="en-IN"/>
         </w:rPr>
-        <w:t>Q11. Why is COUNT(*) preferred over COUNT(column)?</w:t>
-      </w:r>
-    </w:p>
-    <w:p>
-      <w:pPr>
-        <w:spacing w:before="100" w:beforeAutospacing="1" w:after="100" w:afterAutospacing="1" w:line="240" w:lineRule="auto"/>
-        <w:rPr>
-          <w:rFonts w:ascii="Times New Roman" w:eastAsia="Times New Roman" w:hAnsi="Times New Roman" w:cs="Times New Roman"/>
-          <w:sz w:val="24"/>
-          <w:szCs w:val="24"/>
-          <w:lang w:eastAsia="en-IN"/>
-        </w:rPr>
-      </w:pPr>
-      <w:r>
-        <w:rPr>
-          <w:rFonts w:ascii="Times New Roman" w:eastAsia="Times New Roman" w:hAnsi="Times New Roman" w:cs="Times New Roman"/>
-          <w:b/>
-          <w:bCs/>
-          <w:sz w:val="24"/>
-          <w:szCs w:val="24"/>
-          <w:lang w:eastAsia="en-IN"/>
-        </w:rPr>
-        <w:t>Answer:</w:t>
-      </w:r>
+        <w:t xml:space="preserve">Q11. Why is </w:t>
+      </w:r>
+      <w:proofErr w:type="gramStart"/>
+      <w:r>
+        <w:rPr>
+          <w:rFonts w:ascii="Times New Roman" w:eastAsia="Times New Roman" w:hAnsi="Times New Roman" w:cs="Times New Roman"/>
+          <w:b/>
+          <w:bCs/>
+          <w:sz w:val="27"/>
+          <w:szCs w:val="27"/>
+          <w:lang w:eastAsia="en-IN"/>
+        </w:rPr>
+        <w:t>COUNT(</w:t>
+      </w:r>
+      <w:proofErr w:type="gramEnd"/>
+      <w:r>
+        <w:rPr>
+          <w:rFonts w:ascii="Times New Roman" w:eastAsia="Times New Roman" w:hAnsi="Times New Roman" w:cs="Times New Roman"/>
+          <w:b/>
+          <w:bCs/>
+          <w:sz w:val="27"/>
+          <w:szCs w:val="27"/>
+          <w:lang w:eastAsia="en-IN"/>
+        </w:rPr>
+        <w:t>*) preferred over COUNT(column)?</w:t>
+      </w:r>
+    </w:p>
+    <w:p>
+      <w:pPr>
+        <w:spacing w:before="100" w:beforeAutospacing="1" w:after="100" w:afterAutospacing="1" w:line="240" w:lineRule="auto"/>
+        <w:rPr>
+          <w:rFonts w:ascii="Times New Roman" w:eastAsia="Times New Roman" w:hAnsi="Times New Roman" w:cs="Times New Roman"/>
+          <w:sz w:val="24"/>
+          <w:szCs w:val="24"/>
+          <w:lang w:eastAsia="en-IN"/>
+        </w:rPr>
+      </w:pPr>
+      <w:r>
+        <w:rPr>
+          <w:rFonts w:ascii="Times New Roman" w:eastAsia="Times New Roman" w:hAnsi="Times New Roman" w:cs="Times New Roman"/>
+          <w:b/>
+          <w:bCs/>
+          <w:sz w:val="24"/>
+          <w:szCs w:val="24"/>
+          <w:lang w:eastAsia="en-IN"/>
+        </w:rPr>
+        <w:t>Answer</w:t>
+      </w:r>
+      <w:proofErr w:type="gramStart"/>
+      <w:r>
+        <w:rPr>
+          <w:rFonts w:ascii="Times New Roman" w:eastAsia="Times New Roman" w:hAnsi="Times New Roman" w:cs="Times New Roman"/>
+          <w:b/>
+          <w:bCs/>
+          <w:sz w:val="24"/>
+          <w:szCs w:val="24"/>
+          <w:lang w:eastAsia="en-IN"/>
+        </w:rPr>
+        <w:t>:</w:t>
+      </w:r>
+      <w:proofErr w:type="gramEnd"/>
       <w:r>
         <w:rPr>
           <w:rFonts w:ascii="Times New Roman" w:eastAsia="Times New Roman" w:hAnsi="Times New Roman" w:cs="Times New Roman"/>
@@ -1253,8 +1447,21 @@
           <w:lang w:eastAsia="en-IN"/>
         </w:rPr>
         <w:lastRenderedPageBreak/>
-        <w:t>Answer:</w:t>
-      </w:r>
+        <w:t>Answer</w:t>
+      </w:r>
+      <w:proofErr w:type="gramStart"/>
+      <w:r>
+        <w:rPr>
+          <w:rFonts w:ascii="Times New Roman" w:eastAsia="Times New Roman" w:hAnsi="Times New Roman" w:cs="Times New Roman"/>
+          <w:b/>
+          <w:bCs/>
+          <w:sz w:val="24"/>
+          <w:szCs w:val="24"/>
+          <w:lang w:eastAsia="en-IN"/>
+        </w:rPr>
+        <w:t>:</w:t>
+      </w:r>
+      <w:proofErr w:type="gramEnd"/>
       <w:r>
         <w:rPr>
           <w:rFonts w:ascii="Times New Roman" w:eastAsia="Times New Roman" w:hAnsi="Times New Roman" w:cs="Times New Roman"/>
@@ -1332,8 +1539,21 @@
           <w:szCs w:val="24"/>
           <w:lang w:eastAsia="en-IN"/>
         </w:rPr>
-        <w:t>Answer:</w:t>
-      </w:r>
+        <w:t>Answer</w:t>
+      </w:r>
+      <w:proofErr w:type="gramStart"/>
+      <w:r>
+        <w:rPr>
+          <w:rFonts w:ascii="Times New Roman" w:eastAsia="Times New Roman" w:hAnsi="Times New Roman" w:cs="Times New Roman"/>
+          <w:b/>
+          <w:bCs/>
+          <w:sz w:val="24"/>
+          <w:szCs w:val="24"/>
+          <w:lang w:eastAsia="en-IN"/>
+        </w:rPr>
+        <w:t>:</w:t>
+      </w:r>
+      <w:proofErr w:type="gramEnd"/>
       <w:r>
         <w:rPr>
           <w:rFonts w:ascii="Times New Roman" w:eastAsia="Times New Roman" w:hAnsi="Times New Roman" w:cs="Times New Roman"/>
@@ -1411,8 +1631,21 @@
           <w:szCs w:val="24"/>
           <w:lang w:eastAsia="en-IN"/>
         </w:rPr>
-        <w:t>Answer:</w:t>
-      </w:r>
+        <w:t>Answer</w:t>
+      </w:r>
+      <w:proofErr w:type="gramStart"/>
+      <w:r>
+        <w:rPr>
+          <w:rFonts w:ascii="Times New Roman" w:eastAsia="Times New Roman" w:hAnsi="Times New Roman" w:cs="Times New Roman"/>
+          <w:b/>
+          <w:bCs/>
+          <w:sz w:val="24"/>
+          <w:szCs w:val="24"/>
+          <w:lang w:eastAsia="en-IN"/>
+        </w:rPr>
+        <w:t>:</w:t>
+      </w:r>
+      <w:proofErr w:type="gramEnd"/>
       <w:r>
         <w:rPr>
           <w:rFonts w:ascii="Times New Roman" w:eastAsia="Times New Roman" w:hAnsi="Times New Roman" w:cs="Times New Roman"/>
@@ -1468,30 +1701,67 @@
           <w:szCs w:val="27"/>
           <w:lang w:eastAsia="en-IN"/>
         </w:rPr>
-        <w:t>Q15. Why does GROUP BY + JOIN sometimes inflate totals?</w:t>
-      </w:r>
-    </w:p>
-    <w:p>
-      <w:pPr>
-        <w:spacing w:before="100" w:beforeAutospacing="1" w:after="100" w:afterAutospacing="1" w:line="240" w:lineRule="auto"/>
-        <w:rPr>
-          <w:rFonts w:ascii="Times New Roman" w:eastAsia="Times New Roman" w:hAnsi="Times New Roman" w:cs="Times New Roman"/>
-          <w:sz w:val="24"/>
-          <w:szCs w:val="24"/>
-          <w:lang w:eastAsia="en-IN"/>
-        </w:rPr>
-      </w:pPr>
-      <w:r>
-        <w:rPr>
-          <w:rFonts w:ascii="Times New Roman" w:eastAsia="Times New Roman" w:hAnsi="Times New Roman" w:cs="Times New Roman"/>
-          <w:b/>
-          <w:bCs/>
-          <w:sz w:val="24"/>
-          <w:szCs w:val="24"/>
-          <w:lang w:eastAsia="en-IN"/>
-        </w:rPr>
-        <w:t>Answer:</w:t>
-      </w:r>
+        <w:t xml:space="preserve">Q15. Why </w:t>
+      </w:r>
+      <w:proofErr w:type="gramStart"/>
+      <w:r>
+        <w:rPr>
+          <w:rFonts w:ascii="Times New Roman" w:eastAsia="Times New Roman" w:hAnsi="Times New Roman" w:cs="Times New Roman"/>
+          <w:b/>
+          <w:bCs/>
+          <w:sz w:val="27"/>
+          <w:szCs w:val="27"/>
+          <w:lang w:eastAsia="en-IN"/>
+        </w:rPr>
+        <w:t>does</w:t>
+      </w:r>
+      <w:proofErr w:type="gramEnd"/>
+      <w:r>
+        <w:rPr>
+          <w:rFonts w:ascii="Times New Roman" w:eastAsia="Times New Roman" w:hAnsi="Times New Roman" w:cs="Times New Roman"/>
+          <w:b/>
+          <w:bCs/>
+          <w:sz w:val="27"/>
+          <w:szCs w:val="27"/>
+          <w:lang w:eastAsia="en-IN"/>
+        </w:rPr>
+        <w:t xml:space="preserve"> GROUP BY + JOIN sometimes inflate totals?</w:t>
+      </w:r>
+    </w:p>
+    <w:p>
+      <w:pPr>
+        <w:spacing w:before="100" w:beforeAutospacing="1" w:after="100" w:afterAutospacing="1" w:line="240" w:lineRule="auto"/>
+        <w:rPr>
+          <w:rFonts w:ascii="Times New Roman" w:eastAsia="Times New Roman" w:hAnsi="Times New Roman" w:cs="Times New Roman"/>
+          <w:sz w:val="24"/>
+          <w:szCs w:val="24"/>
+          <w:lang w:eastAsia="en-IN"/>
+        </w:rPr>
+      </w:pPr>
+      <w:r>
+        <w:rPr>
+          <w:rFonts w:ascii="Times New Roman" w:eastAsia="Times New Roman" w:hAnsi="Times New Roman" w:cs="Times New Roman"/>
+          <w:b/>
+          <w:bCs/>
+          <w:sz w:val="24"/>
+          <w:szCs w:val="24"/>
+          <w:lang w:eastAsia="en-IN"/>
+        </w:rPr>
+        <w:t>Answer</w:t>
+      </w:r>
+      <w:proofErr w:type="gramStart"/>
+      <w:r>
+        <w:rPr>
+          <w:rFonts w:ascii="Times New Roman" w:eastAsia="Times New Roman" w:hAnsi="Times New Roman" w:cs="Times New Roman"/>
+          <w:b/>
+          <w:bCs/>
+          <w:sz w:val="24"/>
+          <w:szCs w:val="24"/>
+          <w:lang w:eastAsia="en-IN"/>
+        </w:rPr>
+        <w:t>:</w:t>
+      </w:r>
+      <w:proofErr w:type="gramEnd"/>
       <w:r>
         <w:rPr>
           <w:rFonts w:ascii="Times New Roman" w:eastAsia="Times New Roman" w:hAnsi="Times New Roman" w:cs="Times New Roman"/>
@@ -1589,8 +1859,21 @@
           <w:szCs w:val="24"/>
           <w:lang w:eastAsia="en-IN"/>
         </w:rPr>
-        <w:t>Answer:</w:t>
-      </w:r>
+        <w:t>Answer</w:t>
+      </w:r>
+      <w:proofErr w:type="gramStart"/>
+      <w:r>
+        <w:rPr>
+          <w:rFonts w:ascii="Times New Roman" w:eastAsia="Times New Roman" w:hAnsi="Times New Roman" w:cs="Times New Roman"/>
+          <w:b/>
+          <w:bCs/>
+          <w:sz w:val="24"/>
+          <w:szCs w:val="24"/>
+          <w:lang w:eastAsia="en-IN"/>
+        </w:rPr>
+        <w:t>:</w:t>
+      </w:r>
+      <w:proofErr w:type="gramEnd"/>
       <w:r>
         <w:rPr>
           <w:rFonts w:ascii="Times New Roman" w:eastAsia="Times New Roman" w:hAnsi="Times New Roman" w:cs="Times New Roman"/>
@@ -1668,8 +1951,21 @@
           <w:szCs w:val="24"/>
           <w:lang w:eastAsia="en-IN"/>
         </w:rPr>
-        <w:t>Answer:</w:t>
-      </w:r>
+        <w:t>Answer</w:t>
+      </w:r>
+      <w:proofErr w:type="gramStart"/>
+      <w:r>
+        <w:rPr>
+          <w:rFonts w:ascii="Times New Roman" w:eastAsia="Times New Roman" w:hAnsi="Times New Roman" w:cs="Times New Roman"/>
+          <w:b/>
+          <w:bCs/>
+          <w:sz w:val="24"/>
+          <w:szCs w:val="24"/>
+          <w:lang w:eastAsia="en-IN"/>
+        </w:rPr>
+        <w:t>:</w:t>
+      </w:r>
+      <w:proofErr w:type="gramEnd"/>
       <w:r>
         <w:rPr>
           <w:rFonts w:ascii="Times New Roman" w:eastAsia="Times New Roman" w:hAnsi="Times New Roman" w:cs="Times New Roman"/>
@@ -1711,38 +2007,53 @@
           <w:rFonts w:ascii="Times New Roman" w:eastAsia="Times New Roman" w:hAnsi="Times New Roman" w:cs="Times New Roman"/>
           <w:b/>
           <w:bCs/>
-          <w:sz w:val="27"/>
-          <w:szCs w:val="27"/>
-          <w:lang w:eastAsia="en-IN"/>
-        </w:rPr>
-      </w:pPr>
-      <w:r>
-        <w:rPr>
-          <w:rFonts w:ascii="Times New Roman" w:eastAsia="Times New Roman" w:hAnsi="Times New Roman" w:cs="Times New Roman"/>
-          <w:b/>
-          <w:bCs/>
-          <w:sz w:val="27"/>
-          <w:szCs w:val="27"/>
-          <w:lang w:eastAsia="en-IN"/>
-        </w:rPr>
-        <w:t>Q18. Why is COUNT(DISTINCT) expensive?</w:t>
-      </w:r>
-    </w:p>
-    <w:p>
-      <w:pPr>
-        <w:spacing w:before="100" w:beforeAutospacing="1" w:after="100" w:afterAutospacing="1" w:line="240" w:lineRule="auto"/>
-        <w:rPr>
-          <w:rFonts w:ascii="Times New Roman" w:eastAsia="Times New Roman" w:hAnsi="Times New Roman" w:cs="Times New Roman"/>
-          <w:sz w:val="24"/>
-          <w:szCs w:val="24"/>
-          <w:lang w:eastAsia="en-IN"/>
-        </w:rPr>
-      </w:pPr>
-      <w:r>
-        <w:rPr>
-          <w:rFonts w:ascii="Times New Roman" w:eastAsia="Times New Roman" w:hAnsi="Times New Roman" w:cs="Times New Roman"/>
-          <w:b/>
-          <w:bCs/>
+          <w:noProof/>
+          <w:sz w:val="27"/>
+          <w:szCs w:val="27"/>
+          <w:lang w:eastAsia="en-IN"/>
+        </w:rPr>
+      </w:pPr>
+      <w:r>
+        <w:rPr>
+          <w:rFonts w:ascii="Times New Roman" w:eastAsia="Times New Roman" w:hAnsi="Times New Roman" w:cs="Times New Roman"/>
+          <w:b/>
+          <w:bCs/>
+          <w:sz w:val="27"/>
+          <w:szCs w:val="27"/>
+          <w:lang w:eastAsia="en-IN"/>
+        </w:rPr>
+        <w:t xml:space="preserve">Q18. Why is </w:t>
+      </w:r>
+      <w:r>
+        <w:rPr>
+          <w:rFonts w:ascii="Times New Roman" w:eastAsia="Times New Roman" w:hAnsi="Times New Roman" w:cs="Times New Roman"/>
+          <w:b/>
+          <w:bCs/>
+          <w:noProof/>
+          <w:sz w:val="27"/>
+          <w:szCs w:val="27"/>
+          <w:lang w:eastAsia="en-IN"/>
+        </w:rPr>
+        <w:t>COUNT(DISTINCT) expensive?</w:t>
+      </w:r>
+    </w:p>
+    <w:p>
+      <w:pPr>
+        <w:spacing w:before="100" w:beforeAutospacing="1" w:after="100" w:afterAutospacing="1" w:line="240" w:lineRule="auto"/>
+        <w:rPr>
+          <w:rFonts w:ascii="Times New Roman" w:eastAsia="Times New Roman" w:hAnsi="Times New Roman" w:cs="Times New Roman"/>
+          <w:noProof/>
+          <w:sz w:val="24"/>
+          <w:szCs w:val="24"/>
+          <w:lang w:eastAsia="en-IN"/>
+        </w:rPr>
+      </w:pPr>
+      <w:r>
+        <w:rPr>
+          <w:rFonts w:ascii="Times New Roman" w:eastAsia="Times New Roman" w:hAnsi="Times New Roman" w:cs="Times New Roman"/>
+          <w:b/>
+          <w:bCs/>
+          <w:noProof/>
           <w:sz w:val="24"/>
           <w:szCs w:val="24"/>
           <w:lang w:eastAsia="en-IN"/>
@@ -1752,6 +2063,7 @@
       <w:r>
         <w:rPr>
           <w:rFonts w:ascii="Times New Roman" w:eastAsia="Times New Roman" w:hAnsi="Times New Roman" w:cs="Times New Roman"/>
+          <w:noProof/>
           <w:sz w:val="24"/>
           <w:szCs w:val="24"/>
           <w:lang w:eastAsia="en-IN"/>
@@ -1827,8 +2139,21 @@
           <w:lang w:eastAsia="en-IN"/>
         </w:rPr>
         <w:lastRenderedPageBreak/>
-        <w:t>Answer:</w:t>
-      </w:r>
+        <w:t>Answer</w:t>
+      </w:r>
+      <w:proofErr w:type="gramStart"/>
+      <w:r>
+        <w:rPr>
+          <w:rFonts w:ascii="Times New Roman" w:eastAsia="Times New Roman" w:hAnsi="Times New Roman" w:cs="Times New Roman"/>
+          <w:b/>
+          <w:bCs/>
+          <w:sz w:val="24"/>
+          <w:szCs w:val="24"/>
+          <w:lang w:eastAsia="en-IN"/>
+        </w:rPr>
+        <w:t>:</w:t>
+      </w:r>
+      <w:proofErr w:type="gramEnd"/>
       <w:r>
         <w:rPr>
           <w:rFonts w:ascii="Times New Roman" w:eastAsia="Times New Roman" w:hAnsi="Times New Roman" w:cs="Times New Roman"/>
@@ -1837,7 +2162,27 @@
           <w:lang w:eastAsia="en-IN"/>
         </w:rPr>
         <w:br/>
-        <w:t>Yes. SQL evaluates the expression per row, then groups by the result.</w:t>
+        <w:t xml:space="preserve">Yes. SQL evaluates the expression per row, </w:t>
+      </w:r>
+      <w:proofErr w:type="gramStart"/>
+      <w:r>
+        <w:rPr>
+          <w:rFonts w:ascii="Times New Roman" w:eastAsia="Times New Roman" w:hAnsi="Times New Roman" w:cs="Times New Roman"/>
+          <w:sz w:val="24"/>
+          <w:szCs w:val="24"/>
+          <w:lang w:eastAsia="en-IN"/>
+        </w:rPr>
+        <w:t>then</w:t>
+      </w:r>
+      <w:proofErr w:type="gramEnd"/>
+      <w:r>
+        <w:rPr>
+          <w:rFonts w:ascii="Times New Roman" w:eastAsia="Times New Roman" w:hAnsi="Times New Roman" w:cs="Times New Roman"/>
+          <w:sz w:val="24"/>
+          <w:szCs w:val="24"/>
+          <w:lang w:eastAsia="en-IN"/>
+        </w:rPr>
+        <w:t xml:space="preserve"> groups by the result.</w:t>
       </w:r>
     </w:p>
     <w:p>
@@ -1906,8 +2251,21 @@
           <w:szCs w:val="24"/>
           <w:lang w:eastAsia="en-IN"/>
         </w:rPr>
-        <w:t>Answer:</w:t>
-      </w:r>
+        <w:t>Answer</w:t>
+      </w:r>
+      <w:proofErr w:type="gramStart"/>
+      <w:r>
+        <w:rPr>
+          <w:rFonts w:ascii="Times New Roman" w:eastAsia="Times New Roman" w:hAnsi="Times New Roman" w:cs="Times New Roman"/>
+          <w:b/>
+          <w:bCs/>
+          <w:sz w:val="24"/>
+          <w:szCs w:val="24"/>
+          <w:lang w:eastAsia="en-IN"/>
+        </w:rPr>
+        <w:t>:</w:t>
+      </w:r>
+      <w:proofErr w:type="gramEnd"/>
       <w:r>
         <w:rPr>
           <w:rFonts w:ascii="Times New Roman" w:eastAsia="Times New Roman" w:hAnsi="Times New Roman" w:cs="Times New Roman"/>
@@ -1963,30 +2321,66 @@
           <w:szCs w:val="27"/>
           <w:lang w:eastAsia="en-IN"/>
         </w:rPr>
-        <w:t>Q21. Why does PostgreSQL allow grouping by primary key only?</w:t>
-      </w:r>
-    </w:p>
-    <w:p>
-      <w:pPr>
-        <w:spacing w:before="100" w:beforeAutospacing="1" w:after="100" w:afterAutospacing="1" w:line="240" w:lineRule="auto"/>
-        <w:rPr>
-          <w:rFonts w:ascii="Times New Roman" w:eastAsia="Times New Roman" w:hAnsi="Times New Roman" w:cs="Times New Roman"/>
-          <w:sz w:val="24"/>
-          <w:szCs w:val="24"/>
-          <w:lang w:eastAsia="en-IN"/>
-        </w:rPr>
-      </w:pPr>
-      <w:r>
-        <w:rPr>
-          <w:rFonts w:ascii="Times New Roman" w:eastAsia="Times New Roman" w:hAnsi="Times New Roman" w:cs="Times New Roman"/>
-          <w:b/>
-          <w:bCs/>
-          <w:sz w:val="24"/>
-          <w:szCs w:val="24"/>
-          <w:lang w:eastAsia="en-IN"/>
-        </w:rPr>
-        <w:t>Answer:</w:t>
-      </w:r>
+        <w:t xml:space="preserve">Q21. Why does </w:t>
+      </w:r>
+      <w:r>
+        <w:rPr>
+          <w:rFonts w:ascii="Times New Roman" w:eastAsia="Times New Roman" w:hAnsi="Times New Roman" w:cs="Times New Roman"/>
+          <w:b/>
+          <w:bCs/>
+          <w:noProof/>
+          <w:sz w:val="27"/>
+          <w:szCs w:val="27"/>
+          <w:lang w:eastAsia="en-IN"/>
+        </w:rPr>
+        <w:t>PostgreSQL allow</w:t>
+      </w:r>
+      <w:r>
+        <w:rPr>
+          <w:rFonts w:ascii="Times New Roman" w:eastAsia="Times New Roman" w:hAnsi="Times New Roman" w:cs="Times New Roman"/>
+          <w:b/>
+          <w:bCs/>
+          <w:sz w:val="27"/>
+          <w:szCs w:val="27"/>
+          <w:lang w:eastAsia="en-IN"/>
+        </w:rPr>
+        <w:t xml:space="preserve"> grouping by primary key only?</w:t>
+      </w:r>
+    </w:p>
+    <w:p>
+      <w:pPr>
+        <w:spacing w:before="100" w:beforeAutospacing="1" w:after="100" w:afterAutospacing="1" w:line="240" w:lineRule="auto"/>
+        <w:rPr>
+          <w:rFonts w:ascii="Times New Roman" w:eastAsia="Times New Roman" w:hAnsi="Times New Roman" w:cs="Times New Roman"/>
+          <w:sz w:val="24"/>
+          <w:szCs w:val="24"/>
+          <w:lang w:eastAsia="en-IN"/>
+        </w:rPr>
+      </w:pPr>
+      <w:r>
+        <w:rPr>
+          <w:rFonts w:ascii="Times New Roman" w:eastAsia="Times New Roman" w:hAnsi="Times New Roman" w:cs="Times New Roman"/>
+          <w:b/>
+          <w:bCs/>
+          <w:sz w:val="24"/>
+          <w:szCs w:val="24"/>
+          <w:lang w:eastAsia="en-IN"/>
+        </w:rPr>
+        <w:t>Answer</w:t>
+      </w:r>
+      <w:proofErr w:type="gramStart"/>
+      <w:r>
+        <w:rPr>
+          <w:rFonts w:ascii="Times New Roman" w:eastAsia="Times New Roman" w:hAnsi="Times New Roman" w:cs="Times New Roman"/>
+          <w:b/>
+          <w:bCs/>
+          <w:sz w:val="24"/>
+          <w:szCs w:val="24"/>
+          <w:lang w:eastAsia="en-IN"/>
+        </w:rPr>
+        <w:t>:</w:t>
+      </w:r>
+      <w:proofErr w:type="gramEnd"/>
       <w:r>
         <w:rPr>
           <w:rFonts w:ascii="Times New Roman" w:eastAsia="Times New Roman" w:hAnsi="Times New Roman" w:cs="Times New Roman"/>
@@ -2062,30 +2456,67 @@
           <w:szCs w:val="27"/>
           <w:lang w:eastAsia="en-IN"/>
         </w:rPr>
-        <w:t>Q22. Why is GROUP BY considered an aggregation boundary?</w:t>
-      </w:r>
-    </w:p>
-    <w:p>
-      <w:pPr>
-        <w:spacing w:before="100" w:beforeAutospacing="1" w:after="100" w:afterAutospacing="1" w:line="240" w:lineRule="auto"/>
-        <w:rPr>
-          <w:rFonts w:ascii="Times New Roman" w:eastAsia="Times New Roman" w:hAnsi="Times New Roman" w:cs="Times New Roman"/>
-          <w:sz w:val="24"/>
-          <w:szCs w:val="24"/>
-          <w:lang w:eastAsia="en-IN"/>
-        </w:rPr>
-      </w:pPr>
-      <w:r>
-        <w:rPr>
-          <w:rFonts w:ascii="Times New Roman" w:eastAsia="Times New Roman" w:hAnsi="Times New Roman" w:cs="Times New Roman"/>
-          <w:b/>
-          <w:bCs/>
-          <w:sz w:val="24"/>
-          <w:szCs w:val="24"/>
-          <w:lang w:eastAsia="en-IN"/>
-        </w:rPr>
-        <w:t>Answer:</w:t>
-      </w:r>
+        <w:t xml:space="preserve">Q22. Why </w:t>
+      </w:r>
+      <w:proofErr w:type="gramStart"/>
+      <w:r>
+        <w:rPr>
+          <w:rFonts w:ascii="Times New Roman" w:eastAsia="Times New Roman" w:hAnsi="Times New Roman" w:cs="Times New Roman"/>
+          <w:b/>
+          <w:bCs/>
+          <w:sz w:val="27"/>
+          <w:szCs w:val="27"/>
+          <w:lang w:eastAsia="en-IN"/>
+        </w:rPr>
+        <w:t>is GROUP BY</w:t>
+      </w:r>
+      <w:proofErr w:type="gramEnd"/>
+      <w:r>
+        <w:rPr>
+          <w:rFonts w:ascii="Times New Roman" w:eastAsia="Times New Roman" w:hAnsi="Times New Roman" w:cs="Times New Roman"/>
+          <w:b/>
+          <w:bCs/>
+          <w:sz w:val="27"/>
+          <w:szCs w:val="27"/>
+          <w:lang w:eastAsia="en-IN"/>
+        </w:rPr>
+        <w:t xml:space="preserve"> considered an aggregation boundary?</w:t>
+      </w:r>
+    </w:p>
+    <w:p>
+      <w:pPr>
+        <w:spacing w:before="100" w:beforeAutospacing="1" w:after="100" w:afterAutospacing="1" w:line="240" w:lineRule="auto"/>
+        <w:rPr>
+          <w:rFonts w:ascii="Times New Roman" w:eastAsia="Times New Roman" w:hAnsi="Times New Roman" w:cs="Times New Roman"/>
+          <w:sz w:val="24"/>
+          <w:szCs w:val="24"/>
+          <w:lang w:eastAsia="en-IN"/>
+        </w:rPr>
+      </w:pPr>
+      <w:r>
+        <w:rPr>
+          <w:rFonts w:ascii="Times New Roman" w:eastAsia="Times New Roman" w:hAnsi="Times New Roman" w:cs="Times New Roman"/>
+          <w:b/>
+          <w:bCs/>
+          <w:sz w:val="24"/>
+          <w:szCs w:val="24"/>
+          <w:lang w:eastAsia="en-IN"/>
+        </w:rPr>
+        <w:t>Answer</w:t>
+      </w:r>
+      <w:proofErr w:type="gramStart"/>
+      <w:r>
+        <w:rPr>
+          <w:rFonts w:ascii="Times New Roman" w:eastAsia="Times New Roman" w:hAnsi="Times New Roman" w:cs="Times New Roman"/>
+          <w:b/>
+          <w:bCs/>
+          <w:sz w:val="24"/>
+          <w:szCs w:val="24"/>
+          <w:lang w:eastAsia="en-IN"/>
+        </w:rPr>
+        <w:t>:</w:t>
+      </w:r>
+      <w:proofErr w:type="gramEnd"/>
       <w:r>
         <w:rPr>
           <w:rFonts w:ascii="Times New Roman" w:eastAsia="Times New Roman" w:hAnsi="Times New Roman" w:cs="Times New Roman"/>
@@ -2163,8 +2594,21 @@
           <w:szCs w:val="24"/>
           <w:lang w:eastAsia="en-IN"/>
         </w:rPr>
-        <w:t>Answer:</w:t>
-      </w:r>
+        <w:t>Answer</w:t>
+      </w:r>
+      <w:proofErr w:type="gramStart"/>
+      <w:r>
+        <w:rPr>
+          <w:rFonts w:ascii="Times New Roman" w:eastAsia="Times New Roman" w:hAnsi="Times New Roman" w:cs="Times New Roman"/>
+          <w:b/>
+          <w:bCs/>
+          <w:sz w:val="24"/>
+          <w:szCs w:val="24"/>
+          <w:lang w:eastAsia="en-IN"/>
+        </w:rPr>
+        <w:t>:</w:t>
+      </w:r>
+      <w:proofErr w:type="gramEnd"/>
       <w:r>
         <w:rPr>
           <w:rFonts w:ascii="Times New Roman" w:eastAsia="Times New Roman" w:hAnsi="Times New Roman" w:cs="Times New Roman"/>
@@ -2220,30 +2664,67 @@
           <w:szCs w:val="27"/>
           <w:lang w:eastAsia="en-IN"/>
         </w:rPr>
-        <w:t>Q24. Why does GROUP BY + LIMIT without ORDER BY give random rows?</w:t>
-      </w:r>
-    </w:p>
-    <w:p>
-      <w:pPr>
-        <w:spacing w:before="100" w:beforeAutospacing="1" w:after="100" w:afterAutospacing="1" w:line="240" w:lineRule="auto"/>
-        <w:rPr>
-          <w:rFonts w:ascii="Times New Roman" w:eastAsia="Times New Roman" w:hAnsi="Times New Roman" w:cs="Times New Roman"/>
-          <w:sz w:val="24"/>
-          <w:szCs w:val="24"/>
-          <w:lang w:eastAsia="en-IN"/>
-        </w:rPr>
-      </w:pPr>
-      <w:r>
-        <w:rPr>
-          <w:rFonts w:ascii="Times New Roman" w:eastAsia="Times New Roman" w:hAnsi="Times New Roman" w:cs="Times New Roman"/>
-          <w:b/>
-          <w:bCs/>
-          <w:sz w:val="24"/>
-          <w:szCs w:val="24"/>
-          <w:lang w:eastAsia="en-IN"/>
-        </w:rPr>
-        <w:t>Answer:</w:t>
-      </w:r>
+        <w:t xml:space="preserve">Q24. Why </w:t>
+      </w:r>
+      <w:proofErr w:type="gramStart"/>
+      <w:r>
+        <w:rPr>
+          <w:rFonts w:ascii="Times New Roman" w:eastAsia="Times New Roman" w:hAnsi="Times New Roman" w:cs="Times New Roman"/>
+          <w:b/>
+          <w:bCs/>
+          <w:sz w:val="27"/>
+          <w:szCs w:val="27"/>
+          <w:lang w:eastAsia="en-IN"/>
+        </w:rPr>
+        <w:t>does</w:t>
+      </w:r>
+      <w:proofErr w:type="gramEnd"/>
+      <w:r>
+        <w:rPr>
+          <w:rFonts w:ascii="Times New Roman" w:eastAsia="Times New Roman" w:hAnsi="Times New Roman" w:cs="Times New Roman"/>
+          <w:b/>
+          <w:bCs/>
+          <w:sz w:val="27"/>
+          <w:szCs w:val="27"/>
+          <w:lang w:eastAsia="en-IN"/>
+        </w:rPr>
+        <w:t xml:space="preserve"> GROUP BY + LIMIT without ORDER BY give random rows?</w:t>
+      </w:r>
+    </w:p>
+    <w:p>
+      <w:pPr>
+        <w:spacing w:before="100" w:beforeAutospacing="1" w:after="100" w:afterAutospacing="1" w:line="240" w:lineRule="auto"/>
+        <w:rPr>
+          <w:rFonts w:ascii="Times New Roman" w:eastAsia="Times New Roman" w:hAnsi="Times New Roman" w:cs="Times New Roman"/>
+          <w:sz w:val="24"/>
+          <w:szCs w:val="24"/>
+          <w:lang w:eastAsia="en-IN"/>
+        </w:rPr>
+      </w:pPr>
+      <w:r>
+        <w:rPr>
+          <w:rFonts w:ascii="Times New Roman" w:eastAsia="Times New Roman" w:hAnsi="Times New Roman" w:cs="Times New Roman"/>
+          <w:b/>
+          <w:bCs/>
+          <w:sz w:val="24"/>
+          <w:szCs w:val="24"/>
+          <w:lang w:eastAsia="en-IN"/>
+        </w:rPr>
+        <w:t>Answer</w:t>
+      </w:r>
+      <w:proofErr w:type="gramStart"/>
+      <w:r>
+        <w:rPr>
+          <w:rFonts w:ascii="Times New Roman" w:eastAsia="Times New Roman" w:hAnsi="Times New Roman" w:cs="Times New Roman"/>
+          <w:b/>
+          <w:bCs/>
+          <w:sz w:val="24"/>
+          <w:szCs w:val="24"/>
+          <w:lang w:eastAsia="en-IN"/>
+        </w:rPr>
+        <w:t>:</w:t>
+      </w:r>
+      <w:proofErr w:type="gramEnd"/>
       <w:r>
         <w:rPr>
           <w:rFonts w:ascii="Times New Roman" w:eastAsia="Times New Roman" w:hAnsi="Times New Roman" w:cs="Times New Roman"/>
@@ -2321,8 +2802,21 @@
           <w:szCs w:val="24"/>
           <w:lang w:eastAsia="en-IN"/>
         </w:rPr>
-        <w:t>Answer:</w:t>
-      </w:r>
+        <w:t>Answer</w:t>
+      </w:r>
+      <w:proofErr w:type="gramStart"/>
+      <w:r>
+        <w:rPr>
+          <w:rFonts w:ascii="Times New Roman" w:eastAsia="Times New Roman" w:hAnsi="Times New Roman" w:cs="Times New Roman"/>
+          <w:b/>
+          <w:bCs/>
+          <w:sz w:val="24"/>
+          <w:szCs w:val="24"/>
+          <w:lang w:eastAsia="en-IN"/>
+        </w:rPr>
+        <w:t>:</w:t>
+      </w:r>
+      <w:proofErr w:type="gramEnd"/>
       <w:r>
         <w:rPr>
           <w:rFonts w:ascii="Times New Roman" w:eastAsia="Times New Roman" w:hAnsi="Times New Roman" w:cs="Times New Roman"/>
@@ -2379,7 +2873,31 @@
           <w:lang w:eastAsia="en-IN"/>
         </w:rPr>
         <w:lastRenderedPageBreak/>
-        <w:t>🟡 SECTION 2: WHERE vs HAVING (Q26–Q50)</w:t>
+        <w:t xml:space="preserve">🟡 SECTION 2: WHERE </w:t>
+      </w:r>
+      <w:proofErr w:type="spellStart"/>
+      <w:r>
+        <w:rPr>
+          <w:rFonts w:ascii="Times New Roman" w:eastAsia="Times New Roman" w:hAnsi="Times New Roman" w:cs="Times New Roman"/>
+          <w:b/>
+          <w:bCs/>
+          <w:sz w:val="36"/>
+          <w:szCs w:val="36"/>
+          <w:lang w:eastAsia="en-IN"/>
+        </w:rPr>
+        <w:t>vs</w:t>
+      </w:r>
+      <w:proofErr w:type="spellEnd"/>
+      <w:r>
+        <w:rPr>
+          <w:rFonts w:ascii="Times New Roman" w:eastAsia="Times New Roman" w:hAnsi="Times New Roman" w:cs="Times New Roman"/>
+          <w:b/>
+          <w:bCs/>
+          <w:sz w:val="36"/>
+          <w:szCs w:val="36"/>
+          <w:lang w:eastAsia="en-IN"/>
+        </w:rPr>
+        <w:t xml:space="preserve"> HAVING (Q26–Q50)</w:t>
       </w:r>
     </w:p>
     <w:p>
@@ -2448,8 +2966,21 @@
           <w:szCs w:val="24"/>
           <w:lang w:eastAsia="en-IN"/>
         </w:rPr>
-        <w:t>Answer:</w:t>
-      </w:r>
+        <w:t>Answer</w:t>
+      </w:r>
+      <w:proofErr w:type="gramStart"/>
+      <w:r>
+        <w:rPr>
+          <w:rFonts w:ascii="Times New Roman" w:eastAsia="Times New Roman" w:hAnsi="Times New Roman" w:cs="Times New Roman"/>
+          <w:b/>
+          <w:bCs/>
+          <w:sz w:val="24"/>
+          <w:szCs w:val="24"/>
+          <w:lang w:eastAsia="en-IN"/>
+        </w:rPr>
+        <w:t>:</w:t>
+      </w:r>
+      <w:proofErr w:type="gramEnd"/>
       <w:r>
         <w:rPr>
           <w:rFonts w:ascii="Times New Roman" w:eastAsia="Times New Roman" w:hAnsi="Times New Roman" w:cs="Times New Roman"/>
@@ -2547,8 +3078,21 @@
           <w:szCs w:val="24"/>
           <w:lang w:eastAsia="en-IN"/>
         </w:rPr>
-        <w:t>Answer:</w:t>
-      </w:r>
+        <w:t>Answer</w:t>
+      </w:r>
+      <w:proofErr w:type="gramStart"/>
+      <w:r>
+        <w:rPr>
+          <w:rFonts w:ascii="Times New Roman" w:eastAsia="Times New Roman" w:hAnsi="Times New Roman" w:cs="Times New Roman"/>
+          <w:b/>
+          <w:bCs/>
+          <w:sz w:val="24"/>
+          <w:szCs w:val="24"/>
+          <w:lang w:eastAsia="en-IN"/>
+        </w:rPr>
+        <w:t>:</w:t>
+      </w:r>
+      <w:proofErr w:type="gramEnd"/>
       <w:r>
         <w:rPr>
           <w:rFonts w:ascii="Times New Roman" w:eastAsia="Times New Roman" w:hAnsi="Times New Roman" w:cs="Times New Roman"/>
@@ -2684,8 +3228,21 @@
           <w:szCs w:val="24"/>
           <w:lang w:eastAsia="en-IN"/>
         </w:rPr>
-        <w:t>Answer:</w:t>
-      </w:r>
+        <w:t>Answer</w:t>
+      </w:r>
+      <w:proofErr w:type="gramStart"/>
+      <w:r>
+        <w:rPr>
+          <w:rFonts w:ascii="Times New Roman" w:eastAsia="Times New Roman" w:hAnsi="Times New Roman" w:cs="Times New Roman"/>
+          <w:b/>
+          <w:bCs/>
+          <w:sz w:val="24"/>
+          <w:szCs w:val="24"/>
+          <w:lang w:eastAsia="en-IN"/>
+        </w:rPr>
+        <w:t>:</w:t>
+      </w:r>
+      <w:proofErr w:type="gramEnd"/>
       <w:r>
         <w:rPr>
           <w:rFonts w:ascii="Times New Roman" w:eastAsia="Times New Roman" w:hAnsi="Times New Roman" w:cs="Times New Roman"/>
@@ -2783,8 +3340,21 @@
           <w:szCs w:val="24"/>
           <w:lang w:eastAsia="en-IN"/>
         </w:rPr>
-        <w:t>Answer:</w:t>
-      </w:r>
+        <w:t>Answer</w:t>
+      </w:r>
+      <w:proofErr w:type="gramStart"/>
+      <w:r>
+        <w:rPr>
+          <w:rFonts w:ascii="Times New Roman" w:eastAsia="Times New Roman" w:hAnsi="Times New Roman" w:cs="Times New Roman"/>
+          <w:b/>
+          <w:bCs/>
+          <w:sz w:val="24"/>
+          <w:szCs w:val="24"/>
+          <w:lang w:eastAsia="en-IN"/>
+        </w:rPr>
+        <w:t>:</w:t>
+      </w:r>
+      <w:proofErr w:type="gramEnd"/>
       <w:r>
         <w:rPr>
           <w:rFonts w:ascii="Times New Roman" w:eastAsia="Times New Roman" w:hAnsi="Times New Roman" w:cs="Times New Roman"/>
@@ -2862,8 +3432,21 @@
           <w:szCs w:val="24"/>
           <w:lang w:eastAsia="en-IN"/>
         </w:rPr>
-        <w:t>Answer:</w:t>
-      </w:r>
+        <w:t>Answer</w:t>
+      </w:r>
+      <w:proofErr w:type="gramStart"/>
+      <w:r>
+        <w:rPr>
+          <w:rFonts w:ascii="Times New Roman" w:eastAsia="Times New Roman" w:hAnsi="Times New Roman" w:cs="Times New Roman"/>
+          <w:b/>
+          <w:bCs/>
+          <w:sz w:val="24"/>
+          <w:szCs w:val="24"/>
+          <w:lang w:eastAsia="en-IN"/>
+        </w:rPr>
+        <w:t>:</w:t>
+      </w:r>
+      <w:proofErr w:type="gramEnd"/>
       <w:r>
         <w:rPr>
           <w:rFonts w:ascii="Times New Roman" w:eastAsia="Times New Roman" w:hAnsi="Times New Roman" w:cs="Times New Roman"/>
@@ -2919,30 +3502,67 @@
           <w:szCs w:val="27"/>
           <w:lang w:eastAsia="en-IN"/>
         </w:rPr>
-        <w:t>Q31. Why does filtering in HAVING give wrong averages?</w:t>
-      </w:r>
-    </w:p>
-    <w:p>
-      <w:pPr>
-        <w:spacing w:before="100" w:beforeAutospacing="1" w:after="100" w:afterAutospacing="1" w:line="240" w:lineRule="auto"/>
-        <w:rPr>
-          <w:rFonts w:ascii="Times New Roman" w:eastAsia="Times New Roman" w:hAnsi="Times New Roman" w:cs="Times New Roman"/>
-          <w:sz w:val="24"/>
-          <w:szCs w:val="24"/>
-          <w:lang w:eastAsia="en-IN"/>
-        </w:rPr>
-      </w:pPr>
-      <w:r>
-        <w:rPr>
-          <w:rFonts w:ascii="Times New Roman" w:eastAsia="Times New Roman" w:hAnsi="Times New Roman" w:cs="Times New Roman"/>
-          <w:b/>
-          <w:bCs/>
-          <w:sz w:val="24"/>
-          <w:szCs w:val="24"/>
-          <w:lang w:eastAsia="en-IN"/>
-        </w:rPr>
-        <w:t>Answer:</w:t>
-      </w:r>
+        <w:t xml:space="preserve">Q31. Why does filtering in HAVING </w:t>
+      </w:r>
+      <w:proofErr w:type="spellStart"/>
+      <w:r>
+        <w:rPr>
+          <w:rFonts w:ascii="Times New Roman" w:eastAsia="Times New Roman" w:hAnsi="Times New Roman" w:cs="Times New Roman"/>
+          <w:b/>
+          <w:bCs/>
+          <w:sz w:val="27"/>
+          <w:szCs w:val="27"/>
+          <w:lang w:eastAsia="en-IN"/>
+        </w:rPr>
+        <w:t>give</w:t>
+      </w:r>
+      <w:proofErr w:type="spellEnd"/>
+      <w:r>
+        <w:rPr>
+          <w:rFonts w:ascii="Times New Roman" w:eastAsia="Times New Roman" w:hAnsi="Times New Roman" w:cs="Times New Roman"/>
+          <w:b/>
+          <w:bCs/>
+          <w:sz w:val="27"/>
+          <w:szCs w:val="27"/>
+          <w:lang w:eastAsia="en-IN"/>
+        </w:rPr>
+        <w:t xml:space="preserve"> wrong averages?</w:t>
+      </w:r>
+    </w:p>
+    <w:p>
+      <w:pPr>
+        <w:spacing w:before="100" w:beforeAutospacing="1" w:after="100" w:afterAutospacing="1" w:line="240" w:lineRule="auto"/>
+        <w:rPr>
+          <w:rFonts w:ascii="Times New Roman" w:eastAsia="Times New Roman" w:hAnsi="Times New Roman" w:cs="Times New Roman"/>
+          <w:sz w:val="24"/>
+          <w:szCs w:val="24"/>
+          <w:lang w:eastAsia="en-IN"/>
+        </w:rPr>
+      </w:pPr>
+      <w:r>
+        <w:rPr>
+          <w:rFonts w:ascii="Times New Roman" w:eastAsia="Times New Roman" w:hAnsi="Times New Roman" w:cs="Times New Roman"/>
+          <w:b/>
+          <w:bCs/>
+          <w:sz w:val="24"/>
+          <w:szCs w:val="24"/>
+          <w:lang w:eastAsia="en-IN"/>
+        </w:rPr>
+        <w:t>Answer</w:t>
+      </w:r>
+      <w:proofErr w:type="gramStart"/>
+      <w:r>
+        <w:rPr>
+          <w:rFonts w:ascii="Times New Roman" w:eastAsia="Times New Roman" w:hAnsi="Times New Roman" w:cs="Times New Roman"/>
+          <w:b/>
+          <w:bCs/>
+          <w:sz w:val="24"/>
+          <w:szCs w:val="24"/>
+          <w:lang w:eastAsia="en-IN"/>
+        </w:rPr>
+        <w:t>:</w:t>
+      </w:r>
+      <w:proofErr w:type="gramEnd"/>
       <w:r>
         <w:rPr>
           <w:rFonts w:ascii="Times New Roman" w:eastAsia="Times New Roman" w:hAnsi="Times New Roman" w:cs="Times New Roman"/>
@@ -3021,8 +3641,21 @@
           <w:lang w:eastAsia="en-IN"/>
         </w:rPr>
         <w:lastRenderedPageBreak/>
-        <w:t>Answer:</w:t>
-      </w:r>
+        <w:t>Answer</w:t>
+      </w:r>
+      <w:proofErr w:type="gramStart"/>
+      <w:r>
+        <w:rPr>
+          <w:rFonts w:ascii="Times New Roman" w:eastAsia="Times New Roman" w:hAnsi="Times New Roman" w:cs="Times New Roman"/>
+          <w:b/>
+          <w:bCs/>
+          <w:sz w:val="24"/>
+          <w:szCs w:val="24"/>
+          <w:lang w:eastAsia="en-IN"/>
+        </w:rPr>
+        <w:t>:</w:t>
+      </w:r>
+      <w:proofErr w:type="gramEnd"/>
       <w:r>
         <w:rPr>
           <w:rFonts w:ascii="Times New Roman" w:eastAsia="Times New Roman" w:hAnsi="Times New Roman" w:cs="Times New Roman"/>
@@ -3100,8 +3733,21 @@
           <w:szCs w:val="24"/>
           <w:lang w:eastAsia="en-IN"/>
         </w:rPr>
-        <w:t>Answer:</w:t>
-      </w:r>
+        <w:t>Answer</w:t>
+      </w:r>
+      <w:proofErr w:type="gramStart"/>
+      <w:r>
+        <w:rPr>
+          <w:rFonts w:ascii="Times New Roman" w:eastAsia="Times New Roman" w:hAnsi="Times New Roman" w:cs="Times New Roman"/>
+          <w:b/>
+          <w:bCs/>
+          <w:sz w:val="24"/>
+          <w:szCs w:val="24"/>
+          <w:lang w:eastAsia="en-IN"/>
+        </w:rPr>
+        <w:t>:</w:t>
+      </w:r>
+      <w:proofErr w:type="gramEnd"/>
       <w:r>
         <w:rPr>
           <w:rFonts w:ascii="Times New Roman" w:eastAsia="Times New Roman" w:hAnsi="Times New Roman" w:cs="Times New Roman"/>
@@ -3157,30 +3803,67 @@
           <w:szCs w:val="27"/>
           <w:lang w:eastAsia="en-IN"/>
         </w:rPr>
-        <w:t>Q34. Why does HAVING reject non-grouped columns?</w:t>
-      </w:r>
-    </w:p>
-    <w:p>
-      <w:pPr>
-        <w:spacing w:before="100" w:beforeAutospacing="1" w:after="100" w:afterAutospacing="1" w:line="240" w:lineRule="auto"/>
-        <w:rPr>
-          <w:rFonts w:ascii="Times New Roman" w:eastAsia="Times New Roman" w:hAnsi="Times New Roman" w:cs="Times New Roman"/>
-          <w:sz w:val="24"/>
-          <w:szCs w:val="24"/>
-          <w:lang w:eastAsia="en-IN"/>
-        </w:rPr>
-      </w:pPr>
-      <w:r>
-        <w:rPr>
-          <w:rFonts w:ascii="Times New Roman" w:eastAsia="Times New Roman" w:hAnsi="Times New Roman" w:cs="Times New Roman"/>
-          <w:b/>
-          <w:bCs/>
-          <w:sz w:val="24"/>
-          <w:szCs w:val="24"/>
-          <w:lang w:eastAsia="en-IN"/>
-        </w:rPr>
-        <w:t>Answer:</w:t>
-      </w:r>
+        <w:t xml:space="preserve">Q34. Why does HAVING </w:t>
+      </w:r>
+      <w:proofErr w:type="gramStart"/>
+      <w:r>
+        <w:rPr>
+          <w:rFonts w:ascii="Times New Roman" w:eastAsia="Times New Roman" w:hAnsi="Times New Roman" w:cs="Times New Roman"/>
+          <w:b/>
+          <w:bCs/>
+          <w:sz w:val="27"/>
+          <w:szCs w:val="27"/>
+          <w:lang w:eastAsia="en-IN"/>
+        </w:rPr>
+        <w:t>reject</w:t>
+      </w:r>
+      <w:proofErr w:type="gramEnd"/>
+      <w:r>
+        <w:rPr>
+          <w:rFonts w:ascii="Times New Roman" w:eastAsia="Times New Roman" w:hAnsi="Times New Roman" w:cs="Times New Roman"/>
+          <w:b/>
+          <w:bCs/>
+          <w:sz w:val="27"/>
+          <w:szCs w:val="27"/>
+          <w:lang w:eastAsia="en-IN"/>
+        </w:rPr>
+        <w:t xml:space="preserve"> non-grouped columns?</w:t>
+      </w:r>
+    </w:p>
+    <w:p>
+      <w:pPr>
+        <w:spacing w:before="100" w:beforeAutospacing="1" w:after="100" w:afterAutospacing="1" w:line="240" w:lineRule="auto"/>
+        <w:rPr>
+          <w:rFonts w:ascii="Times New Roman" w:eastAsia="Times New Roman" w:hAnsi="Times New Roman" w:cs="Times New Roman"/>
+          <w:sz w:val="24"/>
+          <w:szCs w:val="24"/>
+          <w:lang w:eastAsia="en-IN"/>
+        </w:rPr>
+      </w:pPr>
+      <w:r>
+        <w:rPr>
+          <w:rFonts w:ascii="Times New Roman" w:eastAsia="Times New Roman" w:hAnsi="Times New Roman" w:cs="Times New Roman"/>
+          <w:b/>
+          <w:bCs/>
+          <w:sz w:val="24"/>
+          <w:szCs w:val="24"/>
+          <w:lang w:eastAsia="en-IN"/>
+        </w:rPr>
+        <w:t>Answer</w:t>
+      </w:r>
+      <w:proofErr w:type="gramStart"/>
+      <w:r>
+        <w:rPr>
+          <w:rFonts w:ascii="Times New Roman" w:eastAsia="Times New Roman" w:hAnsi="Times New Roman" w:cs="Times New Roman"/>
+          <w:b/>
+          <w:bCs/>
+          <w:sz w:val="24"/>
+          <w:szCs w:val="24"/>
+          <w:lang w:eastAsia="en-IN"/>
+        </w:rPr>
+        <w:t>:</w:t>
+      </w:r>
+      <w:proofErr w:type="gramEnd"/>
       <w:r>
         <w:rPr>
           <w:rFonts w:ascii="Times New Roman" w:eastAsia="Times New Roman" w:hAnsi="Times New Roman" w:cs="Times New Roman"/>
@@ -3236,30 +3919,67 @@
           <w:szCs w:val="27"/>
           <w:lang w:eastAsia="en-IN"/>
         </w:rPr>
-        <w:t>Q35. Why does HAVING COUNT(*) &gt; 0 usually do nothing?</w:t>
-      </w:r>
-    </w:p>
-    <w:p>
-      <w:pPr>
-        <w:spacing w:before="100" w:beforeAutospacing="1" w:after="100" w:afterAutospacing="1" w:line="240" w:lineRule="auto"/>
-        <w:rPr>
-          <w:rFonts w:ascii="Times New Roman" w:eastAsia="Times New Roman" w:hAnsi="Times New Roman" w:cs="Times New Roman"/>
-          <w:sz w:val="24"/>
-          <w:szCs w:val="24"/>
-          <w:lang w:eastAsia="en-IN"/>
-        </w:rPr>
-      </w:pPr>
-      <w:r>
-        <w:rPr>
-          <w:rFonts w:ascii="Times New Roman" w:eastAsia="Times New Roman" w:hAnsi="Times New Roman" w:cs="Times New Roman"/>
-          <w:b/>
-          <w:bCs/>
-          <w:sz w:val="24"/>
-          <w:szCs w:val="24"/>
-          <w:lang w:eastAsia="en-IN"/>
-        </w:rPr>
-        <w:t>Answer:</w:t>
-      </w:r>
+        <w:t xml:space="preserve">Q35. Why does HAVING </w:t>
+      </w:r>
+      <w:proofErr w:type="gramStart"/>
+      <w:r>
+        <w:rPr>
+          <w:rFonts w:ascii="Times New Roman" w:eastAsia="Times New Roman" w:hAnsi="Times New Roman" w:cs="Times New Roman"/>
+          <w:b/>
+          <w:bCs/>
+          <w:sz w:val="27"/>
+          <w:szCs w:val="27"/>
+          <w:lang w:eastAsia="en-IN"/>
+        </w:rPr>
+        <w:t>COUNT(</w:t>
+      </w:r>
+      <w:proofErr w:type="gramEnd"/>
+      <w:r>
+        <w:rPr>
+          <w:rFonts w:ascii="Times New Roman" w:eastAsia="Times New Roman" w:hAnsi="Times New Roman" w:cs="Times New Roman"/>
+          <w:b/>
+          <w:bCs/>
+          <w:sz w:val="27"/>
+          <w:szCs w:val="27"/>
+          <w:lang w:eastAsia="en-IN"/>
+        </w:rPr>
+        <w:t>*) &gt; 0 usually do nothing?</w:t>
+      </w:r>
+    </w:p>
+    <w:p>
+      <w:pPr>
+        <w:spacing w:before="100" w:beforeAutospacing="1" w:after="100" w:afterAutospacing="1" w:line="240" w:lineRule="auto"/>
+        <w:rPr>
+          <w:rFonts w:ascii="Times New Roman" w:eastAsia="Times New Roman" w:hAnsi="Times New Roman" w:cs="Times New Roman"/>
+          <w:sz w:val="24"/>
+          <w:szCs w:val="24"/>
+          <w:lang w:eastAsia="en-IN"/>
+        </w:rPr>
+      </w:pPr>
+      <w:r>
+        <w:rPr>
+          <w:rFonts w:ascii="Times New Roman" w:eastAsia="Times New Roman" w:hAnsi="Times New Roman" w:cs="Times New Roman"/>
+          <w:b/>
+          <w:bCs/>
+          <w:sz w:val="24"/>
+          <w:szCs w:val="24"/>
+          <w:lang w:eastAsia="en-IN"/>
+        </w:rPr>
+        <w:t>Answer</w:t>
+      </w:r>
+      <w:proofErr w:type="gramStart"/>
+      <w:r>
+        <w:rPr>
+          <w:rFonts w:ascii="Times New Roman" w:eastAsia="Times New Roman" w:hAnsi="Times New Roman" w:cs="Times New Roman"/>
+          <w:b/>
+          <w:bCs/>
+          <w:sz w:val="24"/>
+          <w:szCs w:val="24"/>
+          <w:lang w:eastAsia="en-IN"/>
+        </w:rPr>
+        <w:t>:</w:t>
+      </w:r>
+      <w:proofErr w:type="gramEnd"/>
       <w:r>
         <w:rPr>
           <w:rFonts w:ascii="Times New Roman" w:eastAsia="Times New Roman" w:hAnsi="Times New Roman" w:cs="Times New Roman"/>
@@ -3315,30 +4035,67 @@
           <w:szCs w:val="27"/>
           <w:lang w:eastAsia="en-IN"/>
         </w:rPr>
-        <w:t>Q36. Why does HAVING COUNT(column) behave differently?</w:t>
-      </w:r>
-    </w:p>
-    <w:p>
-      <w:pPr>
-        <w:spacing w:before="100" w:beforeAutospacing="1" w:after="100" w:afterAutospacing="1" w:line="240" w:lineRule="auto"/>
-        <w:rPr>
-          <w:rFonts w:ascii="Times New Roman" w:eastAsia="Times New Roman" w:hAnsi="Times New Roman" w:cs="Times New Roman"/>
-          <w:sz w:val="24"/>
-          <w:szCs w:val="24"/>
-          <w:lang w:eastAsia="en-IN"/>
-        </w:rPr>
-      </w:pPr>
-      <w:r>
-        <w:rPr>
-          <w:rFonts w:ascii="Times New Roman" w:eastAsia="Times New Roman" w:hAnsi="Times New Roman" w:cs="Times New Roman"/>
-          <w:b/>
-          <w:bCs/>
-          <w:sz w:val="24"/>
-          <w:szCs w:val="24"/>
-          <w:lang w:eastAsia="en-IN"/>
-        </w:rPr>
-        <w:t>Answer:</w:t>
-      </w:r>
+        <w:t xml:space="preserve">Q36. Why does HAVING </w:t>
+      </w:r>
+      <w:proofErr w:type="gramStart"/>
+      <w:r>
+        <w:rPr>
+          <w:rFonts w:ascii="Times New Roman" w:eastAsia="Times New Roman" w:hAnsi="Times New Roman" w:cs="Times New Roman"/>
+          <w:b/>
+          <w:bCs/>
+          <w:sz w:val="27"/>
+          <w:szCs w:val="27"/>
+          <w:lang w:eastAsia="en-IN"/>
+        </w:rPr>
+        <w:t>COUNT(</w:t>
+      </w:r>
+      <w:proofErr w:type="gramEnd"/>
+      <w:r>
+        <w:rPr>
+          <w:rFonts w:ascii="Times New Roman" w:eastAsia="Times New Roman" w:hAnsi="Times New Roman" w:cs="Times New Roman"/>
+          <w:b/>
+          <w:bCs/>
+          <w:sz w:val="27"/>
+          <w:szCs w:val="27"/>
+          <w:lang w:eastAsia="en-IN"/>
+        </w:rPr>
+        <w:t>column) behave differently?</w:t>
+      </w:r>
+    </w:p>
+    <w:p>
+      <w:pPr>
+        <w:spacing w:before="100" w:beforeAutospacing="1" w:after="100" w:afterAutospacing="1" w:line="240" w:lineRule="auto"/>
+        <w:rPr>
+          <w:rFonts w:ascii="Times New Roman" w:eastAsia="Times New Roman" w:hAnsi="Times New Roman" w:cs="Times New Roman"/>
+          <w:sz w:val="24"/>
+          <w:szCs w:val="24"/>
+          <w:lang w:eastAsia="en-IN"/>
+        </w:rPr>
+      </w:pPr>
+      <w:r>
+        <w:rPr>
+          <w:rFonts w:ascii="Times New Roman" w:eastAsia="Times New Roman" w:hAnsi="Times New Roman" w:cs="Times New Roman"/>
+          <w:b/>
+          <w:bCs/>
+          <w:sz w:val="24"/>
+          <w:szCs w:val="24"/>
+          <w:lang w:eastAsia="en-IN"/>
+        </w:rPr>
+        <w:t>Answer</w:t>
+      </w:r>
+      <w:proofErr w:type="gramStart"/>
+      <w:r>
+        <w:rPr>
+          <w:rFonts w:ascii="Times New Roman" w:eastAsia="Times New Roman" w:hAnsi="Times New Roman" w:cs="Times New Roman"/>
+          <w:b/>
+          <w:bCs/>
+          <w:sz w:val="24"/>
+          <w:szCs w:val="24"/>
+          <w:lang w:eastAsia="en-IN"/>
+        </w:rPr>
+        <w:t>:</w:t>
+      </w:r>
+      <w:proofErr w:type="gramEnd"/>
       <w:r>
         <w:rPr>
           <w:rFonts w:ascii="Times New Roman" w:eastAsia="Times New Roman" w:hAnsi="Times New Roman" w:cs="Times New Roman"/>
@@ -3416,8 +4173,21 @@
           <w:szCs w:val="24"/>
           <w:lang w:eastAsia="en-IN"/>
         </w:rPr>
-        <w:t>Answer:</w:t>
-      </w:r>
+        <w:t>Answer</w:t>
+      </w:r>
+      <w:proofErr w:type="gramStart"/>
+      <w:r>
+        <w:rPr>
+          <w:rFonts w:ascii="Times New Roman" w:eastAsia="Times New Roman" w:hAnsi="Times New Roman" w:cs="Times New Roman"/>
+          <w:b/>
+          <w:bCs/>
+          <w:sz w:val="24"/>
+          <w:szCs w:val="24"/>
+          <w:lang w:eastAsia="en-IN"/>
+        </w:rPr>
+        <w:t>:</w:t>
+      </w:r>
+      <w:proofErr w:type="gramEnd"/>
       <w:r>
         <w:rPr>
           <w:rFonts w:ascii="Times New Roman" w:eastAsia="Times New Roman" w:hAnsi="Times New Roman" w:cs="Times New Roman"/>
@@ -3515,8 +4285,21 @@
           <w:szCs w:val="24"/>
           <w:lang w:eastAsia="en-IN"/>
         </w:rPr>
-        <w:t>Answer:</w:t>
-      </w:r>
+        <w:t>Answer</w:t>
+      </w:r>
+      <w:proofErr w:type="gramStart"/>
+      <w:r>
+        <w:rPr>
+          <w:rFonts w:ascii="Times New Roman" w:eastAsia="Times New Roman" w:hAnsi="Times New Roman" w:cs="Times New Roman"/>
+          <w:b/>
+          <w:bCs/>
+          <w:sz w:val="24"/>
+          <w:szCs w:val="24"/>
+          <w:lang w:eastAsia="en-IN"/>
+        </w:rPr>
+        <w:t>:</w:t>
+      </w:r>
+      <w:proofErr w:type="gramEnd"/>
       <w:r>
         <w:rPr>
           <w:rFonts w:ascii="Times New Roman" w:eastAsia="Times New Roman" w:hAnsi="Times New Roman" w:cs="Times New Roman"/>
@@ -3595,8 +4378,21 @@
           <w:lang w:eastAsia="en-IN"/>
         </w:rPr>
         <w:lastRenderedPageBreak/>
-        <w:t>Answer:</w:t>
-      </w:r>
+        <w:t>Answer</w:t>
+      </w:r>
+      <w:proofErr w:type="gramStart"/>
+      <w:r>
+        <w:rPr>
+          <w:rFonts w:ascii="Times New Roman" w:eastAsia="Times New Roman" w:hAnsi="Times New Roman" w:cs="Times New Roman"/>
+          <w:b/>
+          <w:bCs/>
+          <w:sz w:val="24"/>
+          <w:szCs w:val="24"/>
+          <w:lang w:eastAsia="en-IN"/>
+        </w:rPr>
+        <w:t>:</w:t>
+      </w:r>
+      <w:proofErr w:type="gramEnd"/>
       <w:r>
         <w:rPr>
           <w:rFonts w:ascii="Times New Roman" w:eastAsia="Times New Roman" w:hAnsi="Times New Roman" w:cs="Times New Roman"/>
@@ -3674,8 +4470,21 @@
           <w:szCs w:val="24"/>
           <w:lang w:eastAsia="en-IN"/>
         </w:rPr>
-        <w:t>Answer:</w:t>
-      </w:r>
+        <w:t>Answer</w:t>
+      </w:r>
+      <w:proofErr w:type="gramStart"/>
+      <w:r>
+        <w:rPr>
+          <w:rFonts w:ascii="Times New Roman" w:eastAsia="Times New Roman" w:hAnsi="Times New Roman" w:cs="Times New Roman"/>
+          <w:b/>
+          <w:bCs/>
+          <w:sz w:val="24"/>
+          <w:szCs w:val="24"/>
+          <w:lang w:eastAsia="en-IN"/>
+        </w:rPr>
+        <w:t>:</w:t>
+      </w:r>
+      <w:proofErr w:type="gramEnd"/>
       <w:r>
         <w:rPr>
           <w:rFonts w:ascii="Times New Roman" w:eastAsia="Times New Roman" w:hAnsi="Times New Roman" w:cs="Times New Roman"/>
@@ -3731,30 +4540,91 @@
           <w:szCs w:val="27"/>
           <w:lang w:eastAsia="en-IN"/>
         </w:rPr>
-        <w:t>Q41. Can HAVING contain subqueries?</w:t>
-      </w:r>
-    </w:p>
-    <w:p>
-      <w:pPr>
-        <w:spacing w:before="100" w:beforeAutospacing="1" w:after="100" w:afterAutospacing="1" w:line="240" w:lineRule="auto"/>
-        <w:rPr>
-          <w:rFonts w:ascii="Times New Roman" w:eastAsia="Times New Roman" w:hAnsi="Times New Roman" w:cs="Times New Roman"/>
-          <w:sz w:val="24"/>
-          <w:szCs w:val="24"/>
-          <w:lang w:eastAsia="en-IN"/>
-        </w:rPr>
-      </w:pPr>
-      <w:r>
-        <w:rPr>
-          <w:rFonts w:ascii="Times New Roman" w:eastAsia="Times New Roman" w:hAnsi="Times New Roman" w:cs="Times New Roman"/>
-          <w:b/>
-          <w:bCs/>
-          <w:sz w:val="24"/>
-          <w:szCs w:val="24"/>
-          <w:lang w:eastAsia="en-IN"/>
-        </w:rPr>
-        <w:t>Answer:</w:t>
-      </w:r>
+        <w:t xml:space="preserve">Q41. Can HAVING </w:t>
+      </w:r>
+      <w:proofErr w:type="gramStart"/>
+      <w:r>
+        <w:rPr>
+          <w:rFonts w:ascii="Times New Roman" w:eastAsia="Times New Roman" w:hAnsi="Times New Roman" w:cs="Times New Roman"/>
+          <w:b/>
+          <w:bCs/>
+          <w:sz w:val="27"/>
+          <w:szCs w:val="27"/>
+          <w:lang w:eastAsia="en-IN"/>
+        </w:rPr>
+        <w:t>contain</w:t>
+      </w:r>
+      <w:proofErr w:type="gramEnd"/>
+      <w:r>
+        <w:rPr>
+          <w:rFonts w:ascii="Times New Roman" w:eastAsia="Times New Roman" w:hAnsi="Times New Roman" w:cs="Times New Roman"/>
+          <w:b/>
+          <w:bCs/>
+          <w:sz w:val="27"/>
+          <w:szCs w:val="27"/>
+          <w:lang w:eastAsia="en-IN"/>
+        </w:rPr>
+        <w:t xml:space="preserve"> </w:t>
+      </w:r>
+      <w:proofErr w:type="spellStart"/>
+      <w:r>
+        <w:rPr>
+          <w:rFonts w:ascii="Times New Roman" w:eastAsia="Times New Roman" w:hAnsi="Times New Roman" w:cs="Times New Roman"/>
+          <w:b/>
+          <w:bCs/>
+          <w:sz w:val="27"/>
+          <w:szCs w:val="27"/>
+          <w:lang w:eastAsia="en-IN"/>
+        </w:rPr>
+        <w:t>subqueries</w:t>
+      </w:r>
+      <w:proofErr w:type="spellEnd"/>
+      <w:r>
+        <w:rPr>
+          <w:rFonts w:ascii="Times New Roman" w:eastAsia="Times New Roman" w:hAnsi="Times New Roman" w:cs="Times New Roman"/>
+          <w:b/>
+          <w:bCs/>
+          <w:sz w:val="27"/>
+          <w:szCs w:val="27"/>
+          <w:lang w:eastAsia="en-IN"/>
+        </w:rPr>
+        <w:t>?</w:t>
+      </w:r>
+    </w:p>
+    <w:p>
+      <w:pPr>
+        <w:spacing w:before="100" w:beforeAutospacing="1" w:after="100" w:afterAutospacing="1" w:line="240" w:lineRule="auto"/>
+        <w:rPr>
+          <w:rFonts w:ascii="Times New Roman" w:eastAsia="Times New Roman" w:hAnsi="Times New Roman" w:cs="Times New Roman"/>
+          <w:sz w:val="24"/>
+          <w:szCs w:val="24"/>
+          <w:lang w:eastAsia="en-IN"/>
+        </w:rPr>
+      </w:pPr>
+      <w:r>
+        <w:rPr>
+          <w:rFonts w:ascii="Times New Roman" w:eastAsia="Times New Roman" w:hAnsi="Times New Roman" w:cs="Times New Roman"/>
+          <w:b/>
+          <w:bCs/>
+          <w:sz w:val="24"/>
+          <w:szCs w:val="24"/>
+          <w:lang w:eastAsia="en-IN"/>
+        </w:rPr>
+        <w:t>Answer</w:t>
+      </w:r>
+      <w:proofErr w:type="gramStart"/>
+      <w:r>
+        <w:rPr>
+          <w:rFonts w:ascii="Times New Roman" w:eastAsia="Times New Roman" w:hAnsi="Times New Roman" w:cs="Times New Roman"/>
+          <w:b/>
+          <w:bCs/>
+          <w:sz w:val="24"/>
+          <w:szCs w:val="24"/>
+          <w:lang w:eastAsia="en-IN"/>
+        </w:rPr>
+        <w:t>:</w:t>
+      </w:r>
+      <w:proofErr w:type="gramEnd"/>
       <w:r>
         <w:rPr>
           <w:rFonts w:ascii="Times New Roman" w:eastAsia="Times New Roman" w:hAnsi="Times New Roman" w:cs="Times New Roman"/>
@@ -3832,8 +4702,21 @@
           <w:szCs w:val="24"/>
           <w:lang w:eastAsia="en-IN"/>
         </w:rPr>
-        <w:t>Answer:</w:t>
-      </w:r>
+        <w:t>Answer</w:t>
+      </w:r>
+      <w:proofErr w:type="gramStart"/>
+      <w:r>
+        <w:rPr>
+          <w:rFonts w:ascii="Times New Roman" w:eastAsia="Times New Roman" w:hAnsi="Times New Roman" w:cs="Times New Roman"/>
+          <w:b/>
+          <w:bCs/>
+          <w:sz w:val="24"/>
+          <w:szCs w:val="24"/>
+          <w:lang w:eastAsia="en-IN"/>
+        </w:rPr>
+        <w:t>:</w:t>
+      </w:r>
+      <w:proofErr w:type="gramEnd"/>
       <w:r>
         <w:rPr>
           <w:rFonts w:ascii="Times New Roman" w:eastAsia="Times New Roman" w:hAnsi="Times New Roman" w:cs="Times New Roman"/>
@@ -3889,30 +4772,67 @@
           <w:szCs w:val="27"/>
           <w:lang w:eastAsia="en-IN"/>
         </w:rPr>
-        <w:t>Q43. Why does HAVING AVG(salary) &gt; 0 include NULL salaries?</w:t>
-      </w:r>
-    </w:p>
-    <w:p>
-      <w:pPr>
-        <w:spacing w:before="100" w:beforeAutospacing="1" w:after="100" w:afterAutospacing="1" w:line="240" w:lineRule="auto"/>
-        <w:rPr>
-          <w:rFonts w:ascii="Times New Roman" w:eastAsia="Times New Roman" w:hAnsi="Times New Roman" w:cs="Times New Roman"/>
-          <w:sz w:val="24"/>
-          <w:szCs w:val="24"/>
-          <w:lang w:eastAsia="en-IN"/>
-        </w:rPr>
-      </w:pPr>
-      <w:r>
-        <w:rPr>
-          <w:rFonts w:ascii="Times New Roman" w:eastAsia="Times New Roman" w:hAnsi="Times New Roman" w:cs="Times New Roman"/>
-          <w:b/>
-          <w:bCs/>
-          <w:sz w:val="24"/>
-          <w:szCs w:val="24"/>
-          <w:lang w:eastAsia="en-IN"/>
-        </w:rPr>
-        <w:t>Answer:</w:t>
-      </w:r>
+        <w:t xml:space="preserve">Q43. Why does HAVING </w:t>
+      </w:r>
+      <w:proofErr w:type="gramStart"/>
+      <w:r>
+        <w:rPr>
+          <w:rFonts w:ascii="Times New Roman" w:eastAsia="Times New Roman" w:hAnsi="Times New Roman" w:cs="Times New Roman"/>
+          <w:b/>
+          <w:bCs/>
+          <w:sz w:val="27"/>
+          <w:szCs w:val="27"/>
+          <w:lang w:eastAsia="en-IN"/>
+        </w:rPr>
+        <w:t>AVG(</w:t>
+      </w:r>
+      <w:proofErr w:type="gramEnd"/>
+      <w:r>
+        <w:rPr>
+          <w:rFonts w:ascii="Times New Roman" w:eastAsia="Times New Roman" w:hAnsi="Times New Roman" w:cs="Times New Roman"/>
+          <w:b/>
+          <w:bCs/>
+          <w:sz w:val="27"/>
+          <w:szCs w:val="27"/>
+          <w:lang w:eastAsia="en-IN"/>
+        </w:rPr>
+        <w:t>salary) &gt; 0 include NULL salaries?</w:t>
+      </w:r>
+    </w:p>
+    <w:p>
+      <w:pPr>
+        <w:spacing w:before="100" w:beforeAutospacing="1" w:after="100" w:afterAutospacing="1" w:line="240" w:lineRule="auto"/>
+        <w:rPr>
+          <w:rFonts w:ascii="Times New Roman" w:eastAsia="Times New Roman" w:hAnsi="Times New Roman" w:cs="Times New Roman"/>
+          <w:sz w:val="24"/>
+          <w:szCs w:val="24"/>
+          <w:lang w:eastAsia="en-IN"/>
+        </w:rPr>
+      </w:pPr>
+      <w:r>
+        <w:rPr>
+          <w:rFonts w:ascii="Times New Roman" w:eastAsia="Times New Roman" w:hAnsi="Times New Roman" w:cs="Times New Roman"/>
+          <w:b/>
+          <w:bCs/>
+          <w:sz w:val="24"/>
+          <w:szCs w:val="24"/>
+          <w:lang w:eastAsia="en-IN"/>
+        </w:rPr>
+        <w:t>Answer</w:t>
+      </w:r>
+      <w:proofErr w:type="gramStart"/>
+      <w:r>
+        <w:rPr>
+          <w:rFonts w:ascii="Times New Roman" w:eastAsia="Times New Roman" w:hAnsi="Times New Roman" w:cs="Times New Roman"/>
+          <w:b/>
+          <w:bCs/>
+          <w:sz w:val="24"/>
+          <w:szCs w:val="24"/>
+          <w:lang w:eastAsia="en-IN"/>
+        </w:rPr>
+        <w:t>:</w:t>
+      </w:r>
+      <w:proofErr w:type="gramEnd"/>
       <w:r>
         <w:rPr>
           <w:rFonts w:ascii="Times New Roman" w:eastAsia="Times New Roman" w:hAnsi="Times New Roman" w:cs="Times New Roman"/>
@@ -3968,30 +4888,67 @@
           <w:szCs w:val="27"/>
           <w:lang w:eastAsia="en-IN"/>
         </w:rPr>
-        <w:t>Q44. Why does HAVING COUNT(*) differ from COUNT(column)?</w:t>
-      </w:r>
-    </w:p>
-    <w:p>
-      <w:pPr>
-        <w:spacing w:before="100" w:beforeAutospacing="1" w:after="100" w:afterAutospacing="1" w:line="240" w:lineRule="auto"/>
-        <w:rPr>
-          <w:rFonts w:ascii="Times New Roman" w:eastAsia="Times New Roman" w:hAnsi="Times New Roman" w:cs="Times New Roman"/>
-          <w:sz w:val="24"/>
-          <w:szCs w:val="24"/>
-          <w:lang w:eastAsia="en-IN"/>
-        </w:rPr>
-      </w:pPr>
-      <w:r>
-        <w:rPr>
-          <w:rFonts w:ascii="Times New Roman" w:eastAsia="Times New Roman" w:hAnsi="Times New Roman" w:cs="Times New Roman"/>
-          <w:b/>
-          <w:bCs/>
-          <w:sz w:val="24"/>
-          <w:szCs w:val="24"/>
-          <w:lang w:eastAsia="en-IN"/>
-        </w:rPr>
-        <w:t>Answer:</w:t>
-      </w:r>
+        <w:t xml:space="preserve">Q44. Why does HAVING </w:t>
+      </w:r>
+      <w:proofErr w:type="gramStart"/>
+      <w:r>
+        <w:rPr>
+          <w:rFonts w:ascii="Times New Roman" w:eastAsia="Times New Roman" w:hAnsi="Times New Roman" w:cs="Times New Roman"/>
+          <w:b/>
+          <w:bCs/>
+          <w:sz w:val="27"/>
+          <w:szCs w:val="27"/>
+          <w:lang w:eastAsia="en-IN"/>
+        </w:rPr>
+        <w:t>COUNT(</w:t>
+      </w:r>
+      <w:proofErr w:type="gramEnd"/>
+      <w:r>
+        <w:rPr>
+          <w:rFonts w:ascii="Times New Roman" w:eastAsia="Times New Roman" w:hAnsi="Times New Roman" w:cs="Times New Roman"/>
+          <w:b/>
+          <w:bCs/>
+          <w:sz w:val="27"/>
+          <w:szCs w:val="27"/>
+          <w:lang w:eastAsia="en-IN"/>
+        </w:rPr>
+        <w:t>*) differ from COUNT(column)?</w:t>
+      </w:r>
+    </w:p>
+    <w:p>
+      <w:pPr>
+        <w:spacing w:before="100" w:beforeAutospacing="1" w:after="100" w:afterAutospacing="1" w:line="240" w:lineRule="auto"/>
+        <w:rPr>
+          <w:rFonts w:ascii="Times New Roman" w:eastAsia="Times New Roman" w:hAnsi="Times New Roman" w:cs="Times New Roman"/>
+          <w:sz w:val="24"/>
+          <w:szCs w:val="24"/>
+          <w:lang w:eastAsia="en-IN"/>
+        </w:rPr>
+      </w:pPr>
+      <w:r>
+        <w:rPr>
+          <w:rFonts w:ascii="Times New Roman" w:eastAsia="Times New Roman" w:hAnsi="Times New Roman" w:cs="Times New Roman"/>
+          <w:b/>
+          <w:bCs/>
+          <w:sz w:val="24"/>
+          <w:szCs w:val="24"/>
+          <w:lang w:eastAsia="en-IN"/>
+        </w:rPr>
+        <w:t>Answer</w:t>
+      </w:r>
+      <w:proofErr w:type="gramStart"/>
+      <w:r>
+        <w:rPr>
+          <w:rFonts w:ascii="Times New Roman" w:eastAsia="Times New Roman" w:hAnsi="Times New Roman" w:cs="Times New Roman"/>
+          <w:b/>
+          <w:bCs/>
+          <w:sz w:val="24"/>
+          <w:szCs w:val="24"/>
+          <w:lang w:eastAsia="en-IN"/>
+        </w:rPr>
+        <w:t>:</w:t>
+      </w:r>
+      <w:proofErr w:type="gramEnd"/>
       <w:r>
         <w:rPr>
           <w:rFonts w:ascii="Times New Roman" w:eastAsia="Times New Roman" w:hAnsi="Times New Roman" w:cs="Times New Roman"/>
@@ -4069,8 +5026,21 @@
           <w:szCs w:val="24"/>
           <w:lang w:eastAsia="en-IN"/>
         </w:rPr>
-        <w:t>Answer:</w:t>
-      </w:r>
+        <w:t>Answer</w:t>
+      </w:r>
+      <w:proofErr w:type="gramStart"/>
+      <w:r>
+        <w:rPr>
+          <w:rFonts w:ascii="Times New Roman" w:eastAsia="Times New Roman" w:hAnsi="Times New Roman" w:cs="Times New Roman"/>
+          <w:b/>
+          <w:bCs/>
+          <w:sz w:val="24"/>
+          <w:szCs w:val="24"/>
+          <w:lang w:eastAsia="en-IN"/>
+        </w:rPr>
+        <w:t>:</w:t>
+      </w:r>
+      <w:proofErr w:type="gramEnd"/>
       <w:r>
         <w:rPr>
           <w:rFonts w:ascii="Times New Roman" w:eastAsia="Times New Roman" w:hAnsi="Times New Roman" w:cs="Times New Roman"/>
@@ -4149,8 +5119,21 @@
           <w:lang w:eastAsia="en-IN"/>
         </w:rPr>
         <w:lastRenderedPageBreak/>
-        <w:t>Answer:</w:t>
-      </w:r>
+        <w:t>Answer</w:t>
+      </w:r>
+      <w:proofErr w:type="gramStart"/>
+      <w:r>
+        <w:rPr>
+          <w:rFonts w:ascii="Times New Roman" w:eastAsia="Times New Roman" w:hAnsi="Times New Roman" w:cs="Times New Roman"/>
+          <w:b/>
+          <w:bCs/>
+          <w:sz w:val="24"/>
+          <w:szCs w:val="24"/>
+          <w:lang w:eastAsia="en-IN"/>
+        </w:rPr>
+        <w:t>:</w:t>
+      </w:r>
+      <w:proofErr w:type="gramEnd"/>
       <w:r>
         <w:rPr>
           <w:rFonts w:ascii="Times New Roman" w:eastAsia="Times New Roman" w:hAnsi="Times New Roman" w:cs="Times New Roman"/>
@@ -4226,30 +5209,67 @@
           <w:szCs w:val="27"/>
           <w:lang w:eastAsia="en-IN"/>
         </w:rPr>
-        <w:t>Q47. Why does HAVING require GROUP BY context?</w:t>
-      </w:r>
-    </w:p>
-    <w:p>
-      <w:pPr>
-        <w:spacing w:before="100" w:beforeAutospacing="1" w:after="100" w:afterAutospacing="1" w:line="240" w:lineRule="auto"/>
-        <w:rPr>
-          <w:rFonts w:ascii="Times New Roman" w:eastAsia="Times New Roman" w:hAnsi="Times New Roman" w:cs="Times New Roman"/>
-          <w:sz w:val="24"/>
-          <w:szCs w:val="24"/>
-          <w:lang w:eastAsia="en-IN"/>
-        </w:rPr>
-      </w:pPr>
-      <w:r>
-        <w:rPr>
-          <w:rFonts w:ascii="Times New Roman" w:eastAsia="Times New Roman" w:hAnsi="Times New Roman" w:cs="Times New Roman"/>
-          <w:b/>
-          <w:bCs/>
-          <w:sz w:val="24"/>
-          <w:szCs w:val="24"/>
-          <w:lang w:eastAsia="en-IN"/>
-        </w:rPr>
-        <w:t>Answer:</w:t>
-      </w:r>
+        <w:t xml:space="preserve">Q47. Why does HAVING </w:t>
+      </w:r>
+      <w:proofErr w:type="gramStart"/>
+      <w:r>
+        <w:rPr>
+          <w:rFonts w:ascii="Times New Roman" w:eastAsia="Times New Roman" w:hAnsi="Times New Roman" w:cs="Times New Roman"/>
+          <w:b/>
+          <w:bCs/>
+          <w:sz w:val="27"/>
+          <w:szCs w:val="27"/>
+          <w:lang w:eastAsia="en-IN"/>
+        </w:rPr>
+        <w:t>require</w:t>
+      </w:r>
+      <w:proofErr w:type="gramEnd"/>
+      <w:r>
+        <w:rPr>
+          <w:rFonts w:ascii="Times New Roman" w:eastAsia="Times New Roman" w:hAnsi="Times New Roman" w:cs="Times New Roman"/>
+          <w:b/>
+          <w:bCs/>
+          <w:sz w:val="27"/>
+          <w:szCs w:val="27"/>
+          <w:lang w:eastAsia="en-IN"/>
+        </w:rPr>
+        <w:t xml:space="preserve"> GROUP BY context?</w:t>
+      </w:r>
+    </w:p>
+    <w:p>
+      <w:pPr>
+        <w:spacing w:before="100" w:beforeAutospacing="1" w:after="100" w:afterAutospacing="1" w:line="240" w:lineRule="auto"/>
+        <w:rPr>
+          <w:rFonts w:ascii="Times New Roman" w:eastAsia="Times New Roman" w:hAnsi="Times New Roman" w:cs="Times New Roman"/>
+          <w:sz w:val="24"/>
+          <w:szCs w:val="24"/>
+          <w:lang w:eastAsia="en-IN"/>
+        </w:rPr>
+      </w:pPr>
+      <w:r>
+        <w:rPr>
+          <w:rFonts w:ascii="Times New Roman" w:eastAsia="Times New Roman" w:hAnsi="Times New Roman" w:cs="Times New Roman"/>
+          <w:b/>
+          <w:bCs/>
+          <w:sz w:val="24"/>
+          <w:szCs w:val="24"/>
+          <w:lang w:eastAsia="en-IN"/>
+        </w:rPr>
+        <w:t>Answer</w:t>
+      </w:r>
+      <w:proofErr w:type="gramStart"/>
+      <w:r>
+        <w:rPr>
+          <w:rFonts w:ascii="Times New Roman" w:eastAsia="Times New Roman" w:hAnsi="Times New Roman" w:cs="Times New Roman"/>
+          <w:b/>
+          <w:bCs/>
+          <w:sz w:val="24"/>
+          <w:szCs w:val="24"/>
+          <w:lang w:eastAsia="en-IN"/>
+        </w:rPr>
+        <w:t>:</w:t>
+      </w:r>
+      <w:proofErr w:type="gramEnd"/>
       <w:r>
         <w:rPr>
           <w:rFonts w:ascii="Times New Roman" w:eastAsia="Times New Roman" w:hAnsi="Times New Roman" w:cs="Times New Roman"/>
@@ -4327,8 +5347,21 @@
           <w:szCs w:val="24"/>
           <w:lang w:eastAsia="en-IN"/>
         </w:rPr>
-        <w:t>Answer:</w:t>
-      </w:r>
+        <w:t>Answer</w:t>
+      </w:r>
+      <w:proofErr w:type="gramStart"/>
+      <w:r>
+        <w:rPr>
+          <w:rFonts w:ascii="Times New Roman" w:eastAsia="Times New Roman" w:hAnsi="Times New Roman" w:cs="Times New Roman"/>
+          <w:b/>
+          <w:bCs/>
+          <w:sz w:val="24"/>
+          <w:szCs w:val="24"/>
+          <w:lang w:eastAsia="en-IN"/>
+        </w:rPr>
+        <w:t>:</w:t>
+      </w:r>
+      <w:proofErr w:type="gramEnd"/>
       <w:r>
         <w:rPr>
           <w:rFonts w:ascii="Times New Roman" w:eastAsia="Times New Roman" w:hAnsi="Times New Roman" w:cs="Times New Roman"/>
@@ -4406,8 +5439,21 @@
           <w:szCs w:val="24"/>
           <w:lang w:eastAsia="en-IN"/>
         </w:rPr>
-        <w:t>Answer:</w:t>
-      </w:r>
+        <w:t>Answer</w:t>
+      </w:r>
+      <w:proofErr w:type="gramStart"/>
+      <w:r>
+        <w:rPr>
+          <w:rFonts w:ascii="Times New Roman" w:eastAsia="Times New Roman" w:hAnsi="Times New Roman" w:cs="Times New Roman"/>
+          <w:b/>
+          <w:bCs/>
+          <w:sz w:val="24"/>
+          <w:szCs w:val="24"/>
+          <w:lang w:eastAsia="en-IN"/>
+        </w:rPr>
+        <w:t>:</w:t>
+      </w:r>
+      <w:proofErr w:type="gramEnd"/>
       <w:r>
         <w:rPr>
           <w:rFonts w:ascii="Times New Roman" w:eastAsia="Times New Roman" w:hAnsi="Times New Roman" w:cs="Times New Roman"/>
@@ -4463,30 +5509,67 @@
           <w:szCs w:val="27"/>
           <w:lang w:eastAsia="en-IN"/>
         </w:rPr>
-        <w:t>Q50. Why does HAVING define business rules?</w:t>
-      </w:r>
-    </w:p>
-    <w:p>
-      <w:pPr>
-        <w:spacing w:before="100" w:beforeAutospacing="1" w:after="100" w:afterAutospacing="1" w:line="240" w:lineRule="auto"/>
-        <w:rPr>
-          <w:rFonts w:ascii="Times New Roman" w:eastAsia="Times New Roman" w:hAnsi="Times New Roman" w:cs="Times New Roman"/>
-          <w:sz w:val="24"/>
-          <w:szCs w:val="24"/>
-          <w:lang w:eastAsia="en-IN"/>
-        </w:rPr>
-      </w:pPr>
-      <w:r>
-        <w:rPr>
-          <w:rFonts w:ascii="Times New Roman" w:eastAsia="Times New Roman" w:hAnsi="Times New Roman" w:cs="Times New Roman"/>
-          <w:b/>
-          <w:bCs/>
-          <w:sz w:val="24"/>
-          <w:szCs w:val="24"/>
-          <w:lang w:eastAsia="en-IN"/>
-        </w:rPr>
-        <w:t>Answer:</w:t>
-      </w:r>
+        <w:t xml:space="preserve">Q50. Why does HAVING </w:t>
+      </w:r>
+      <w:proofErr w:type="gramStart"/>
+      <w:r>
+        <w:rPr>
+          <w:rFonts w:ascii="Times New Roman" w:eastAsia="Times New Roman" w:hAnsi="Times New Roman" w:cs="Times New Roman"/>
+          <w:b/>
+          <w:bCs/>
+          <w:sz w:val="27"/>
+          <w:szCs w:val="27"/>
+          <w:lang w:eastAsia="en-IN"/>
+        </w:rPr>
+        <w:t>define</w:t>
+      </w:r>
+      <w:proofErr w:type="gramEnd"/>
+      <w:r>
+        <w:rPr>
+          <w:rFonts w:ascii="Times New Roman" w:eastAsia="Times New Roman" w:hAnsi="Times New Roman" w:cs="Times New Roman"/>
+          <w:b/>
+          <w:bCs/>
+          <w:sz w:val="27"/>
+          <w:szCs w:val="27"/>
+          <w:lang w:eastAsia="en-IN"/>
+        </w:rPr>
+        <w:t xml:space="preserve"> business rules?</w:t>
+      </w:r>
+    </w:p>
+    <w:p>
+      <w:pPr>
+        <w:spacing w:before="100" w:beforeAutospacing="1" w:after="100" w:afterAutospacing="1" w:line="240" w:lineRule="auto"/>
+        <w:rPr>
+          <w:rFonts w:ascii="Times New Roman" w:eastAsia="Times New Roman" w:hAnsi="Times New Roman" w:cs="Times New Roman"/>
+          <w:sz w:val="24"/>
+          <w:szCs w:val="24"/>
+          <w:lang w:eastAsia="en-IN"/>
+        </w:rPr>
+      </w:pPr>
+      <w:r>
+        <w:rPr>
+          <w:rFonts w:ascii="Times New Roman" w:eastAsia="Times New Roman" w:hAnsi="Times New Roman" w:cs="Times New Roman"/>
+          <w:b/>
+          <w:bCs/>
+          <w:sz w:val="24"/>
+          <w:szCs w:val="24"/>
+          <w:lang w:eastAsia="en-IN"/>
+        </w:rPr>
+        <w:t>Answer</w:t>
+      </w:r>
+      <w:proofErr w:type="gramStart"/>
+      <w:r>
+        <w:rPr>
+          <w:rFonts w:ascii="Times New Roman" w:eastAsia="Times New Roman" w:hAnsi="Times New Roman" w:cs="Times New Roman"/>
+          <w:b/>
+          <w:bCs/>
+          <w:sz w:val="24"/>
+          <w:szCs w:val="24"/>
+          <w:lang w:eastAsia="en-IN"/>
+        </w:rPr>
+        <w:t>:</w:t>
+      </w:r>
+      <w:proofErr w:type="gramEnd"/>
       <w:r>
         <w:rPr>
           <w:rFonts w:ascii="Times New Roman" w:eastAsia="Times New Roman" w:hAnsi="Times New Roman" w:cs="Times New Roman"/>
@@ -4611,8 +5694,21 @@
           <w:szCs w:val="24"/>
           <w:lang w:eastAsia="en-IN"/>
         </w:rPr>
-        <w:t>Answer:</w:t>
-      </w:r>
+        <w:t>Answer</w:t>
+      </w:r>
+      <w:proofErr w:type="gramStart"/>
+      <w:r>
+        <w:rPr>
+          <w:rFonts w:ascii="Times New Roman" w:eastAsia="Times New Roman" w:hAnsi="Times New Roman" w:cs="Times New Roman"/>
+          <w:b/>
+          <w:bCs/>
+          <w:sz w:val="24"/>
+          <w:szCs w:val="24"/>
+          <w:lang w:eastAsia="en-IN"/>
+        </w:rPr>
+        <w:t>:</w:t>
+      </w:r>
+      <w:proofErr w:type="gramEnd"/>
       <w:r>
         <w:rPr>
           <w:rFonts w:ascii="Times New Roman" w:eastAsia="Times New Roman" w:hAnsi="Times New Roman" w:cs="Times New Roman"/>
@@ -4690,8 +5786,21 @@
           <w:szCs w:val="24"/>
           <w:lang w:eastAsia="en-IN"/>
         </w:rPr>
-        <w:t>Answer:</w:t>
-      </w:r>
+        <w:t>Answer</w:t>
+      </w:r>
+      <w:proofErr w:type="gramStart"/>
+      <w:r>
+        <w:rPr>
+          <w:rFonts w:ascii="Times New Roman" w:eastAsia="Times New Roman" w:hAnsi="Times New Roman" w:cs="Times New Roman"/>
+          <w:b/>
+          <w:bCs/>
+          <w:sz w:val="24"/>
+          <w:szCs w:val="24"/>
+          <w:lang w:eastAsia="en-IN"/>
+        </w:rPr>
+        <w:t>:</w:t>
+      </w:r>
+      <w:proofErr w:type="gramEnd"/>
       <w:r>
         <w:rPr>
           <w:rFonts w:ascii="Times New Roman" w:eastAsia="Times New Roman" w:hAnsi="Times New Roman" w:cs="Times New Roman"/>
@@ -4770,8 +5879,21 @@
           <w:szCs w:val="24"/>
           <w:lang w:eastAsia="en-IN"/>
         </w:rPr>
-        <w:t>Answer:</w:t>
-      </w:r>
+        <w:t>Answer</w:t>
+      </w:r>
+      <w:proofErr w:type="gramStart"/>
+      <w:r>
+        <w:rPr>
+          <w:rFonts w:ascii="Times New Roman" w:eastAsia="Times New Roman" w:hAnsi="Times New Roman" w:cs="Times New Roman"/>
+          <w:b/>
+          <w:bCs/>
+          <w:sz w:val="24"/>
+          <w:szCs w:val="24"/>
+          <w:lang w:eastAsia="en-IN"/>
+        </w:rPr>
+        <w:t>:</w:t>
+      </w:r>
+      <w:proofErr w:type="gramEnd"/>
       <w:r>
         <w:rPr>
           <w:rFonts w:ascii="Times New Roman" w:eastAsia="Times New Roman" w:hAnsi="Times New Roman" w:cs="Times New Roman"/>
@@ -4849,8 +5971,21 @@
           <w:szCs w:val="24"/>
           <w:lang w:eastAsia="en-IN"/>
         </w:rPr>
-        <w:t>Answer:</w:t>
-      </w:r>
+        <w:t>Answer</w:t>
+      </w:r>
+      <w:proofErr w:type="gramStart"/>
+      <w:r>
+        <w:rPr>
+          <w:rFonts w:ascii="Times New Roman" w:eastAsia="Times New Roman" w:hAnsi="Times New Roman" w:cs="Times New Roman"/>
+          <w:b/>
+          <w:bCs/>
+          <w:sz w:val="24"/>
+          <w:szCs w:val="24"/>
+          <w:lang w:eastAsia="en-IN"/>
+        </w:rPr>
+        <w:t>:</w:t>
+      </w:r>
+      <w:proofErr w:type="gramEnd"/>
       <w:r>
         <w:rPr>
           <w:rFonts w:ascii="Times New Roman" w:eastAsia="Times New Roman" w:hAnsi="Times New Roman" w:cs="Times New Roman"/>
@@ -4928,8 +6063,21 @@
           <w:szCs w:val="24"/>
           <w:lang w:eastAsia="en-IN"/>
         </w:rPr>
-        <w:t>Answer:</w:t>
-      </w:r>
+        <w:t>Answer</w:t>
+      </w:r>
+      <w:proofErr w:type="gramStart"/>
+      <w:r>
+        <w:rPr>
+          <w:rFonts w:ascii="Times New Roman" w:eastAsia="Times New Roman" w:hAnsi="Times New Roman" w:cs="Times New Roman"/>
+          <w:b/>
+          <w:bCs/>
+          <w:sz w:val="24"/>
+          <w:szCs w:val="24"/>
+          <w:lang w:eastAsia="en-IN"/>
+        </w:rPr>
+        <w:t>:</w:t>
+      </w:r>
+      <w:proofErr w:type="gramEnd"/>
       <w:r>
         <w:rPr>
           <w:rFonts w:ascii="Times New Roman" w:eastAsia="Times New Roman" w:hAnsi="Times New Roman" w:cs="Times New Roman"/>
@@ -5007,8 +6155,21 @@
           <w:szCs w:val="24"/>
           <w:lang w:eastAsia="en-IN"/>
         </w:rPr>
-        <w:t>Answer:</w:t>
-      </w:r>
+        <w:t>Answer</w:t>
+      </w:r>
+      <w:proofErr w:type="gramStart"/>
+      <w:r>
+        <w:rPr>
+          <w:rFonts w:ascii="Times New Roman" w:eastAsia="Times New Roman" w:hAnsi="Times New Roman" w:cs="Times New Roman"/>
+          <w:b/>
+          <w:bCs/>
+          <w:sz w:val="24"/>
+          <w:szCs w:val="24"/>
+          <w:lang w:eastAsia="en-IN"/>
+        </w:rPr>
+        <w:t>:</w:t>
+      </w:r>
+      <w:proofErr w:type="gramEnd"/>
       <w:r>
         <w:rPr>
           <w:rFonts w:ascii="Times New Roman" w:eastAsia="Times New Roman" w:hAnsi="Times New Roman" w:cs="Times New Roman"/>
@@ -5086,8 +6247,21 @@
           <w:szCs w:val="24"/>
           <w:lang w:eastAsia="en-IN"/>
         </w:rPr>
-        <w:t>Answer:</w:t>
-      </w:r>
+        <w:t>Answer</w:t>
+      </w:r>
+      <w:proofErr w:type="gramStart"/>
+      <w:r>
+        <w:rPr>
+          <w:rFonts w:ascii="Times New Roman" w:eastAsia="Times New Roman" w:hAnsi="Times New Roman" w:cs="Times New Roman"/>
+          <w:b/>
+          <w:bCs/>
+          <w:sz w:val="24"/>
+          <w:szCs w:val="24"/>
+          <w:lang w:eastAsia="en-IN"/>
+        </w:rPr>
+        <w:t>:</w:t>
+      </w:r>
+      <w:proofErr w:type="gramEnd"/>
       <w:r>
         <w:rPr>
           <w:rFonts w:ascii="Times New Roman" w:eastAsia="Times New Roman" w:hAnsi="Times New Roman" w:cs="Times New Roman"/>
@@ -5165,8 +6339,21 @@
           <w:szCs w:val="24"/>
           <w:lang w:eastAsia="en-IN"/>
         </w:rPr>
-        <w:t>Answer:</w:t>
-      </w:r>
+        <w:t>Answer</w:t>
+      </w:r>
+      <w:proofErr w:type="gramStart"/>
+      <w:r>
+        <w:rPr>
+          <w:rFonts w:ascii="Times New Roman" w:eastAsia="Times New Roman" w:hAnsi="Times New Roman" w:cs="Times New Roman"/>
+          <w:b/>
+          <w:bCs/>
+          <w:sz w:val="24"/>
+          <w:szCs w:val="24"/>
+          <w:lang w:eastAsia="en-IN"/>
+        </w:rPr>
+        <w:t>:</w:t>
+      </w:r>
+      <w:proofErr w:type="gramEnd"/>
       <w:r>
         <w:rPr>
           <w:rFonts w:ascii="Times New Roman" w:eastAsia="Times New Roman" w:hAnsi="Times New Roman" w:cs="Times New Roman"/>
@@ -5244,8 +6431,21 @@
           <w:szCs w:val="24"/>
           <w:lang w:eastAsia="en-IN"/>
         </w:rPr>
-        <w:t>Answer:</w:t>
-      </w:r>
+        <w:t>Answer</w:t>
+      </w:r>
+      <w:proofErr w:type="gramStart"/>
+      <w:r>
+        <w:rPr>
+          <w:rFonts w:ascii="Times New Roman" w:eastAsia="Times New Roman" w:hAnsi="Times New Roman" w:cs="Times New Roman"/>
+          <w:b/>
+          <w:bCs/>
+          <w:sz w:val="24"/>
+          <w:szCs w:val="24"/>
+          <w:lang w:eastAsia="en-IN"/>
+        </w:rPr>
+        <w:t>:</w:t>
+      </w:r>
+      <w:proofErr w:type="gramEnd"/>
       <w:r>
         <w:rPr>
           <w:rFonts w:ascii="Times New Roman" w:eastAsia="Times New Roman" w:hAnsi="Times New Roman" w:cs="Times New Roman"/>
@@ -5324,8 +6524,21 @@
           <w:szCs w:val="24"/>
           <w:lang w:eastAsia="en-IN"/>
         </w:rPr>
-        <w:t>Answer:</w:t>
-      </w:r>
+        <w:t>Answer</w:t>
+      </w:r>
+      <w:proofErr w:type="gramStart"/>
+      <w:r>
+        <w:rPr>
+          <w:rFonts w:ascii="Times New Roman" w:eastAsia="Times New Roman" w:hAnsi="Times New Roman" w:cs="Times New Roman"/>
+          <w:b/>
+          <w:bCs/>
+          <w:sz w:val="24"/>
+          <w:szCs w:val="24"/>
+          <w:lang w:eastAsia="en-IN"/>
+        </w:rPr>
+        <w:t>:</w:t>
+      </w:r>
+      <w:proofErr w:type="gramEnd"/>
       <w:r>
         <w:rPr>
           <w:rFonts w:ascii="Times New Roman" w:eastAsia="Times New Roman" w:hAnsi="Times New Roman" w:cs="Times New Roman"/>
@@ -5403,8 +6616,21 @@
           <w:szCs w:val="24"/>
           <w:lang w:eastAsia="en-IN"/>
         </w:rPr>
-        <w:t>Answer:</w:t>
-      </w:r>
+        <w:t>Answer</w:t>
+      </w:r>
+      <w:proofErr w:type="gramStart"/>
+      <w:r>
+        <w:rPr>
+          <w:rFonts w:ascii="Times New Roman" w:eastAsia="Times New Roman" w:hAnsi="Times New Roman" w:cs="Times New Roman"/>
+          <w:b/>
+          <w:bCs/>
+          <w:sz w:val="24"/>
+          <w:szCs w:val="24"/>
+          <w:lang w:eastAsia="en-IN"/>
+        </w:rPr>
+        <w:t>:</w:t>
+      </w:r>
+      <w:proofErr w:type="gramEnd"/>
       <w:r>
         <w:rPr>
           <w:rFonts w:ascii="Times New Roman" w:eastAsia="Times New Roman" w:hAnsi="Times New Roman" w:cs="Times New Roman"/>
@@ -5482,8 +6708,21 @@
           <w:szCs w:val="24"/>
           <w:lang w:eastAsia="en-IN"/>
         </w:rPr>
-        <w:t>Answer:</w:t>
-      </w:r>
+        <w:t>Answer</w:t>
+      </w:r>
+      <w:proofErr w:type="gramStart"/>
+      <w:r>
+        <w:rPr>
+          <w:rFonts w:ascii="Times New Roman" w:eastAsia="Times New Roman" w:hAnsi="Times New Roman" w:cs="Times New Roman"/>
+          <w:b/>
+          <w:bCs/>
+          <w:sz w:val="24"/>
+          <w:szCs w:val="24"/>
+          <w:lang w:eastAsia="en-IN"/>
+        </w:rPr>
+        <w:t>:</w:t>
+      </w:r>
+      <w:proofErr w:type="gramEnd"/>
       <w:r>
         <w:rPr>
           <w:rFonts w:ascii="Times New Roman" w:eastAsia="Times New Roman" w:hAnsi="Times New Roman" w:cs="Times New Roman"/>
@@ -5561,8 +6800,21 @@
           <w:szCs w:val="24"/>
           <w:lang w:eastAsia="en-IN"/>
         </w:rPr>
-        <w:t>Answer:</w:t>
-      </w:r>
+        <w:t>Answer</w:t>
+      </w:r>
+      <w:proofErr w:type="gramStart"/>
+      <w:r>
+        <w:rPr>
+          <w:rFonts w:ascii="Times New Roman" w:eastAsia="Times New Roman" w:hAnsi="Times New Roman" w:cs="Times New Roman"/>
+          <w:b/>
+          <w:bCs/>
+          <w:sz w:val="24"/>
+          <w:szCs w:val="24"/>
+          <w:lang w:eastAsia="en-IN"/>
+        </w:rPr>
+        <w:t>:</w:t>
+      </w:r>
+      <w:proofErr w:type="gramEnd"/>
       <w:r>
         <w:rPr>
           <w:rFonts w:ascii="Times New Roman" w:eastAsia="Times New Roman" w:hAnsi="Times New Roman" w:cs="Times New Roman"/>
@@ -5640,8 +6892,21 @@
           <w:szCs w:val="24"/>
           <w:lang w:eastAsia="en-IN"/>
         </w:rPr>
-        <w:t>Answer:</w:t>
-      </w:r>
+        <w:t>Answer</w:t>
+      </w:r>
+      <w:proofErr w:type="gramStart"/>
+      <w:r>
+        <w:rPr>
+          <w:rFonts w:ascii="Times New Roman" w:eastAsia="Times New Roman" w:hAnsi="Times New Roman" w:cs="Times New Roman"/>
+          <w:b/>
+          <w:bCs/>
+          <w:sz w:val="24"/>
+          <w:szCs w:val="24"/>
+          <w:lang w:eastAsia="en-IN"/>
+        </w:rPr>
+        <w:t>:</w:t>
+      </w:r>
+      <w:proofErr w:type="gramEnd"/>
       <w:r>
         <w:rPr>
           <w:rFonts w:ascii="Times New Roman" w:eastAsia="Times New Roman" w:hAnsi="Times New Roman" w:cs="Times New Roman"/>
@@ -5719,8 +6984,21 @@
           <w:szCs w:val="24"/>
           <w:lang w:eastAsia="en-IN"/>
         </w:rPr>
-        <w:t>Answer:</w:t>
-      </w:r>
+        <w:t>Answer</w:t>
+      </w:r>
+      <w:proofErr w:type="gramStart"/>
+      <w:r>
+        <w:rPr>
+          <w:rFonts w:ascii="Times New Roman" w:eastAsia="Times New Roman" w:hAnsi="Times New Roman" w:cs="Times New Roman"/>
+          <w:b/>
+          <w:bCs/>
+          <w:sz w:val="24"/>
+          <w:szCs w:val="24"/>
+          <w:lang w:eastAsia="en-IN"/>
+        </w:rPr>
+        <w:t>:</w:t>
+      </w:r>
+      <w:proofErr w:type="gramEnd"/>
       <w:r>
         <w:rPr>
           <w:rFonts w:ascii="Times New Roman" w:eastAsia="Times New Roman" w:hAnsi="Times New Roman" w:cs="Times New Roman"/>
@@ -5798,8 +7076,21 @@
           <w:szCs w:val="24"/>
           <w:lang w:eastAsia="en-IN"/>
         </w:rPr>
-        <w:t>Answer:</w:t>
-      </w:r>
+        <w:t>Answer</w:t>
+      </w:r>
+      <w:proofErr w:type="gramStart"/>
+      <w:r>
+        <w:rPr>
+          <w:rFonts w:ascii="Times New Roman" w:eastAsia="Times New Roman" w:hAnsi="Times New Roman" w:cs="Times New Roman"/>
+          <w:b/>
+          <w:bCs/>
+          <w:sz w:val="24"/>
+          <w:szCs w:val="24"/>
+          <w:lang w:eastAsia="en-IN"/>
+        </w:rPr>
+        <w:t>:</w:t>
+      </w:r>
+      <w:proofErr w:type="gramEnd"/>
       <w:r>
         <w:rPr>
           <w:rFonts w:ascii="Times New Roman" w:eastAsia="Times New Roman" w:hAnsi="Times New Roman" w:cs="Times New Roman"/>
@@ -5878,8 +7169,21 @@
           <w:szCs w:val="24"/>
           <w:lang w:eastAsia="en-IN"/>
         </w:rPr>
-        <w:t>Answer:</w:t>
-      </w:r>
+        <w:t>Answer</w:t>
+      </w:r>
+      <w:proofErr w:type="gramStart"/>
+      <w:r>
+        <w:rPr>
+          <w:rFonts w:ascii="Times New Roman" w:eastAsia="Times New Roman" w:hAnsi="Times New Roman" w:cs="Times New Roman"/>
+          <w:b/>
+          <w:bCs/>
+          <w:sz w:val="24"/>
+          <w:szCs w:val="24"/>
+          <w:lang w:eastAsia="en-IN"/>
+        </w:rPr>
+        <w:t>:</w:t>
+      </w:r>
+      <w:proofErr w:type="gramEnd"/>
       <w:r>
         <w:rPr>
           <w:rFonts w:ascii="Times New Roman" w:eastAsia="Times New Roman" w:hAnsi="Times New Roman" w:cs="Times New Roman"/>
@@ -5957,8 +7261,21 @@
           <w:szCs w:val="24"/>
           <w:lang w:eastAsia="en-IN"/>
         </w:rPr>
-        <w:t>Answer:</w:t>
-      </w:r>
+        <w:t>Answer</w:t>
+      </w:r>
+      <w:proofErr w:type="gramStart"/>
+      <w:r>
+        <w:rPr>
+          <w:rFonts w:ascii="Times New Roman" w:eastAsia="Times New Roman" w:hAnsi="Times New Roman" w:cs="Times New Roman"/>
+          <w:b/>
+          <w:bCs/>
+          <w:sz w:val="24"/>
+          <w:szCs w:val="24"/>
+          <w:lang w:eastAsia="en-IN"/>
+        </w:rPr>
+        <w:t>:</w:t>
+      </w:r>
+      <w:proofErr w:type="gramEnd"/>
       <w:r>
         <w:rPr>
           <w:rFonts w:ascii="Times New Roman" w:eastAsia="Times New Roman" w:hAnsi="Times New Roman" w:cs="Times New Roman"/>
@@ -6014,30 +7331,67 @@
           <w:szCs w:val="27"/>
           <w:lang w:eastAsia="en-IN"/>
         </w:rPr>
-        <w:t>Q69. Why does JOIN + GROUP BY need careful grain?</w:t>
-      </w:r>
-    </w:p>
-    <w:p>
-      <w:pPr>
-        <w:spacing w:before="100" w:beforeAutospacing="1" w:after="100" w:afterAutospacing="1" w:line="240" w:lineRule="auto"/>
-        <w:rPr>
-          <w:rFonts w:ascii="Times New Roman" w:eastAsia="Times New Roman" w:hAnsi="Times New Roman" w:cs="Times New Roman"/>
-          <w:sz w:val="24"/>
-          <w:szCs w:val="24"/>
-          <w:lang w:eastAsia="en-IN"/>
-        </w:rPr>
-      </w:pPr>
-      <w:r>
-        <w:rPr>
-          <w:rFonts w:ascii="Times New Roman" w:eastAsia="Times New Roman" w:hAnsi="Times New Roman" w:cs="Times New Roman"/>
-          <w:b/>
-          <w:bCs/>
-          <w:sz w:val="24"/>
-          <w:szCs w:val="24"/>
-          <w:lang w:eastAsia="en-IN"/>
-        </w:rPr>
-        <w:t>Answer:</w:t>
-      </w:r>
+        <w:t xml:space="preserve">Q69. Why </w:t>
+      </w:r>
+      <w:proofErr w:type="gramStart"/>
+      <w:r>
+        <w:rPr>
+          <w:rFonts w:ascii="Times New Roman" w:eastAsia="Times New Roman" w:hAnsi="Times New Roman" w:cs="Times New Roman"/>
+          <w:b/>
+          <w:bCs/>
+          <w:sz w:val="27"/>
+          <w:szCs w:val="27"/>
+          <w:lang w:eastAsia="en-IN"/>
+        </w:rPr>
+        <w:t>does</w:t>
+      </w:r>
+      <w:proofErr w:type="gramEnd"/>
+      <w:r>
+        <w:rPr>
+          <w:rFonts w:ascii="Times New Roman" w:eastAsia="Times New Roman" w:hAnsi="Times New Roman" w:cs="Times New Roman"/>
+          <w:b/>
+          <w:bCs/>
+          <w:sz w:val="27"/>
+          <w:szCs w:val="27"/>
+          <w:lang w:eastAsia="en-IN"/>
+        </w:rPr>
+        <w:t xml:space="preserve"> JOIN + GROUP BY need careful grain?</w:t>
+      </w:r>
+    </w:p>
+    <w:p>
+      <w:pPr>
+        <w:spacing w:before="100" w:beforeAutospacing="1" w:after="100" w:afterAutospacing="1" w:line="240" w:lineRule="auto"/>
+        <w:rPr>
+          <w:rFonts w:ascii="Times New Roman" w:eastAsia="Times New Roman" w:hAnsi="Times New Roman" w:cs="Times New Roman"/>
+          <w:sz w:val="24"/>
+          <w:szCs w:val="24"/>
+          <w:lang w:eastAsia="en-IN"/>
+        </w:rPr>
+      </w:pPr>
+      <w:r>
+        <w:rPr>
+          <w:rFonts w:ascii="Times New Roman" w:eastAsia="Times New Roman" w:hAnsi="Times New Roman" w:cs="Times New Roman"/>
+          <w:b/>
+          <w:bCs/>
+          <w:sz w:val="24"/>
+          <w:szCs w:val="24"/>
+          <w:lang w:eastAsia="en-IN"/>
+        </w:rPr>
+        <w:t>Answer</w:t>
+      </w:r>
+      <w:proofErr w:type="gramStart"/>
+      <w:r>
+        <w:rPr>
+          <w:rFonts w:ascii="Times New Roman" w:eastAsia="Times New Roman" w:hAnsi="Times New Roman" w:cs="Times New Roman"/>
+          <w:b/>
+          <w:bCs/>
+          <w:sz w:val="24"/>
+          <w:szCs w:val="24"/>
+          <w:lang w:eastAsia="en-IN"/>
+        </w:rPr>
+        <w:t>:</w:t>
+      </w:r>
+      <w:proofErr w:type="gramEnd"/>
       <w:r>
         <w:rPr>
           <w:rFonts w:ascii="Times New Roman" w:eastAsia="Times New Roman" w:hAnsi="Times New Roman" w:cs="Times New Roman"/>
@@ -6115,8 +7469,21 @@
           <w:szCs w:val="24"/>
           <w:lang w:eastAsia="en-IN"/>
         </w:rPr>
-        <w:t>Answer:</w:t>
-      </w:r>
+        <w:t>Answer</w:t>
+      </w:r>
+      <w:proofErr w:type="gramStart"/>
+      <w:r>
+        <w:rPr>
+          <w:rFonts w:ascii="Times New Roman" w:eastAsia="Times New Roman" w:hAnsi="Times New Roman" w:cs="Times New Roman"/>
+          <w:b/>
+          <w:bCs/>
+          <w:sz w:val="24"/>
+          <w:szCs w:val="24"/>
+          <w:lang w:eastAsia="en-IN"/>
+        </w:rPr>
+        <w:t>:</w:t>
+      </w:r>
+      <w:proofErr w:type="gramEnd"/>
       <w:r>
         <w:rPr>
           <w:rFonts w:ascii="Times New Roman" w:eastAsia="Times New Roman" w:hAnsi="Times New Roman" w:cs="Times New Roman"/>
@@ -6194,8 +7561,21 @@
           <w:szCs w:val="24"/>
           <w:lang w:eastAsia="en-IN"/>
         </w:rPr>
-        <w:t>Answer:</w:t>
-      </w:r>
+        <w:t>Answer</w:t>
+      </w:r>
+      <w:proofErr w:type="gramStart"/>
+      <w:r>
+        <w:rPr>
+          <w:rFonts w:ascii="Times New Roman" w:eastAsia="Times New Roman" w:hAnsi="Times New Roman" w:cs="Times New Roman"/>
+          <w:b/>
+          <w:bCs/>
+          <w:sz w:val="24"/>
+          <w:szCs w:val="24"/>
+          <w:lang w:eastAsia="en-IN"/>
+        </w:rPr>
+        <w:t>:</w:t>
+      </w:r>
+      <w:proofErr w:type="gramEnd"/>
       <w:r>
         <w:rPr>
           <w:rFonts w:ascii="Times New Roman" w:eastAsia="Times New Roman" w:hAnsi="Times New Roman" w:cs="Times New Roman"/>
@@ -6273,8 +7653,21 @@
           <w:szCs w:val="24"/>
           <w:lang w:eastAsia="en-IN"/>
         </w:rPr>
-        <w:t>Answer:</w:t>
-      </w:r>
+        <w:t>Answer</w:t>
+      </w:r>
+      <w:proofErr w:type="gramStart"/>
+      <w:r>
+        <w:rPr>
+          <w:rFonts w:ascii="Times New Roman" w:eastAsia="Times New Roman" w:hAnsi="Times New Roman" w:cs="Times New Roman"/>
+          <w:b/>
+          <w:bCs/>
+          <w:sz w:val="24"/>
+          <w:szCs w:val="24"/>
+          <w:lang w:eastAsia="en-IN"/>
+        </w:rPr>
+        <w:t>:</w:t>
+      </w:r>
+      <w:proofErr w:type="gramEnd"/>
       <w:r>
         <w:rPr>
           <w:rFonts w:ascii="Times New Roman" w:eastAsia="Times New Roman" w:hAnsi="Times New Roman" w:cs="Times New Roman"/>
@@ -6352,8 +7745,21 @@
           <w:szCs w:val="24"/>
           <w:lang w:eastAsia="en-IN"/>
         </w:rPr>
-        <w:t>Answer:</w:t>
-      </w:r>
+        <w:t>Answer</w:t>
+      </w:r>
+      <w:proofErr w:type="gramStart"/>
+      <w:r>
+        <w:rPr>
+          <w:rFonts w:ascii="Times New Roman" w:eastAsia="Times New Roman" w:hAnsi="Times New Roman" w:cs="Times New Roman"/>
+          <w:b/>
+          <w:bCs/>
+          <w:sz w:val="24"/>
+          <w:szCs w:val="24"/>
+          <w:lang w:eastAsia="en-IN"/>
+        </w:rPr>
+        <w:t>:</w:t>
+      </w:r>
+      <w:proofErr w:type="gramEnd"/>
       <w:r>
         <w:rPr>
           <w:rFonts w:ascii="Times New Roman" w:eastAsia="Times New Roman" w:hAnsi="Times New Roman" w:cs="Times New Roman"/>
@@ -6432,8 +7838,21 @@
           <w:szCs w:val="24"/>
           <w:lang w:eastAsia="en-IN"/>
         </w:rPr>
-        <w:t>Answer:</w:t>
-      </w:r>
+        <w:t>Answer</w:t>
+      </w:r>
+      <w:proofErr w:type="gramStart"/>
+      <w:r>
+        <w:rPr>
+          <w:rFonts w:ascii="Times New Roman" w:eastAsia="Times New Roman" w:hAnsi="Times New Roman" w:cs="Times New Roman"/>
+          <w:b/>
+          <w:bCs/>
+          <w:sz w:val="24"/>
+          <w:szCs w:val="24"/>
+          <w:lang w:eastAsia="en-IN"/>
+        </w:rPr>
+        <w:t>:</w:t>
+      </w:r>
+      <w:proofErr w:type="gramEnd"/>
       <w:r>
         <w:rPr>
           <w:rFonts w:ascii="Times New Roman" w:eastAsia="Times New Roman" w:hAnsi="Times New Roman" w:cs="Times New Roman"/>
@@ -6511,8 +7930,21 @@
           <w:szCs w:val="24"/>
           <w:lang w:eastAsia="en-IN"/>
         </w:rPr>
-        <w:t>Answer:</w:t>
-      </w:r>
+        <w:t>Answer</w:t>
+      </w:r>
+      <w:proofErr w:type="gramStart"/>
+      <w:r>
+        <w:rPr>
+          <w:rFonts w:ascii="Times New Roman" w:eastAsia="Times New Roman" w:hAnsi="Times New Roman" w:cs="Times New Roman"/>
+          <w:b/>
+          <w:bCs/>
+          <w:sz w:val="24"/>
+          <w:szCs w:val="24"/>
+          <w:lang w:eastAsia="en-IN"/>
+        </w:rPr>
+        <w:t>:</w:t>
+      </w:r>
+      <w:proofErr w:type="gramEnd"/>
       <w:r>
         <w:rPr>
           <w:rFonts w:ascii="Times New Roman" w:eastAsia="Times New Roman" w:hAnsi="Times New Roman" w:cs="Times New Roman"/>
@@ -6637,8 +8069,21 @@
           <w:szCs w:val="24"/>
           <w:lang w:eastAsia="en-IN"/>
         </w:rPr>
-        <w:t>Answer:</w:t>
-      </w:r>
+        <w:t>Answer</w:t>
+      </w:r>
+      <w:proofErr w:type="gramStart"/>
+      <w:r>
+        <w:rPr>
+          <w:rFonts w:ascii="Times New Roman" w:eastAsia="Times New Roman" w:hAnsi="Times New Roman" w:cs="Times New Roman"/>
+          <w:b/>
+          <w:bCs/>
+          <w:sz w:val="24"/>
+          <w:szCs w:val="24"/>
+          <w:lang w:eastAsia="en-IN"/>
+        </w:rPr>
+        <w:t>:</w:t>
+      </w:r>
+      <w:proofErr w:type="gramEnd"/>
       <w:r>
         <w:rPr>
           <w:rFonts w:ascii="Times New Roman" w:eastAsia="Times New Roman" w:hAnsi="Times New Roman" w:cs="Times New Roman"/>
@@ -6738,8 +8183,21 @@
           <w:szCs w:val="24"/>
           <w:lang w:eastAsia="en-IN"/>
         </w:rPr>
-        <w:t>Answer:</w:t>
-      </w:r>
+        <w:t>Answer</w:t>
+      </w:r>
+      <w:proofErr w:type="gramStart"/>
+      <w:r>
+        <w:rPr>
+          <w:rFonts w:ascii="Times New Roman" w:eastAsia="Times New Roman" w:hAnsi="Times New Roman" w:cs="Times New Roman"/>
+          <w:b/>
+          <w:bCs/>
+          <w:sz w:val="24"/>
+          <w:szCs w:val="24"/>
+          <w:lang w:eastAsia="en-IN"/>
+        </w:rPr>
+        <w:t>:</w:t>
+      </w:r>
+      <w:proofErr w:type="gramEnd"/>
       <w:r>
         <w:rPr>
           <w:rFonts w:ascii="Times New Roman" w:eastAsia="Times New Roman" w:hAnsi="Times New Roman" w:cs="Times New Roman"/>
@@ -6839,8 +8297,21 @@
           <w:szCs w:val="24"/>
           <w:lang w:eastAsia="en-IN"/>
         </w:rPr>
-        <w:t>Answer:</w:t>
-      </w:r>
+        <w:t>Answer</w:t>
+      </w:r>
+      <w:proofErr w:type="gramStart"/>
+      <w:r>
+        <w:rPr>
+          <w:rFonts w:ascii="Times New Roman" w:eastAsia="Times New Roman" w:hAnsi="Times New Roman" w:cs="Times New Roman"/>
+          <w:b/>
+          <w:bCs/>
+          <w:sz w:val="24"/>
+          <w:szCs w:val="24"/>
+          <w:lang w:eastAsia="en-IN"/>
+        </w:rPr>
+        <w:t>:</w:t>
+      </w:r>
+      <w:proofErr w:type="gramEnd"/>
       <w:r>
         <w:rPr>
           <w:rFonts w:ascii="Times New Roman" w:eastAsia="Times New Roman" w:hAnsi="Times New Roman" w:cs="Times New Roman"/>
@@ -6918,8 +8389,21 @@
           <w:szCs w:val="24"/>
           <w:lang w:eastAsia="en-IN"/>
         </w:rPr>
-        <w:t>Answer:</w:t>
-      </w:r>
+        <w:t>Answer</w:t>
+      </w:r>
+      <w:proofErr w:type="gramStart"/>
+      <w:r>
+        <w:rPr>
+          <w:rFonts w:ascii="Times New Roman" w:eastAsia="Times New Roman" w:hAnsi="Times New Roman" w:cs="Times New Roman"/>
+          <w:b/>
+          <w:bCs/>
+          <w:sz w:val="24"/>
+          <w:szCs w:val="24"/>
+          <w:lang w:eastAsia="en-IN"/>
+        </w:rPr>
+        <w:t>:</w:t>
+      </w:r>
+      <w:proofErr w:type="gramEnd"/>
       <w:r>
         <w:rPr>
           <w:rFonts w:ascii="Times New Roman" w:eastAsia="Times New Roman" w:hAnsi="Times New Roman" w:cs="Times New Roman"/>
@@ -6998,8 +8482,21 @@
           <w:szCs w:val="24"/>
           <w:lang w:eastAsia="en-IN"/>
         </w:rPr>
-        <w:t>Answer:</w:t>
-      </w:r>
+        <w:t>Answer</w:t>
+      </w:r>
+      <w:proofErr w:type="gramStart"/>
+      <w:r>
+        <w:rPr>
+          <w:rFonts w:ascii="Times New Roman" w:eastAsia="Times New Roman" w:hAnsi="Times New Roman" w:cs="Times New Roman"/>
+          <w:b/>
+          <w:bCs/>
+          <w:sz w:val="24"/>
+          <w:szCs w:val="24"/>
+          <w:lang w:eastAsia="en-IN"/>
+        </w:rPr>
+        <w:t>:</w:t>
+      </w:r>
+      <w:proofErr w:type="gramEnd"/>
       <w:r>
         <w:rPr>
           <w:rFonts w:ascii="Times New Roman" w:eastAsia="Times New Roman" w:hAnsi="Times New Roman" w:cs="Times New Roman"/>
@@ -7077,8 +8574,21 @@
           <w:szCs w:val="24"/>
           <w:lang w:eastAsia="en-IN"/>
         </w:rPr>
-        <w:t>Answer:</w:t>
-      </w:r>
+        <w:t>Answer</w:t>
+      </w:r>
+      <w:proofErr w:type="gramStart"/>
+      <w:r>
+        <w:rPr>
+          <w:rFonts w:ascii="Times New Roman" w:eastAsia="Times New Roman" w:hAnsi="Times New Roman" w:cs="Times New Roman"/>
+          <w:b/>
+          <w:bCs/>
+          <w:sz w:val="24"/>
+          <w:szCs w:val="24"/>
+          <w:lang w:eastAsia="en-IN"/>
+        </w:rPr>
+        <w:t>:</w:t>
+      </w:r>
+      <w:proofErr w:type="gramEnd"/>
       <w:r>
         <w:rPr>
           <w:rFonts w:ascii="Times New Roman" w:eastAsia="Times New Roman" w:hAnsi="Times New Roman" w:cs="Times New Roman"/>
@@ -7089,6 +8599,8 @@
         <w:br/>
         <w:t>GROUP BY runs before SELECT.</w:t>
       </w:r>
+      <w:bookmarkStart w:id="0" w:name="_GoBack"/>
+      <w:bookmarkEnd w:id="0"/>
     </w:p>
     <w:p>
       <w:pPr>
@@ -7156,8 +8668,21 @@
           <w:szCs w:val="24"/>
           <w:lang w:eastAsia="en-IN"/>
         </w:rPr>
-        <w:t>Answer:</w:t>
-      </w:r>
+        <w:t>Answer</w:t>
+      </w:r>
+      <w:proofErr w:type="gramStart"/>
+      <w:r>
+        <w:rPr>
+          <w:rFonts w:ascii="Times New Roman" w:eastAsia="Times New Roman" w:hAnsi="Times New Roman" w:cs="Times New Roman"/>
+          <w:b/>
+          <w:bCs/>
+          <w:sz w:val="24"/>
+          <w:szCs w:val="24"/>
+          <w:lang w:eastAsia="en-IN"/>
+        </w:rPr>
+        <w:t>:</w:t>
+      </w:r>
+      <w:proofErr w:type="gramEnd"/>
       <w:r>
         <w:rPr>
           <w:rFonts w:ascii="Times New Roman" w:eastAsia="Times New Roman" w:hAnsi="Times New Roman" w:cs="Times New Roman"/>
@@ -7235,8 +8760,21 @@
           <w:szCs w:val="24"/>
           <w:lang w:eastAsia="en-IN"/>
         </w:rPr>
-        <w:t>Answer:</w:t>
-      </w:r>
+        <w:t>Answer</w:t>
+      </w:r>
+      <w:proofErr w:type="gramStart"/>
+      <w:r>
+        <w:rPr>
+          <w:rFonts w:ascii="Times New Roman" w:eastAsia="Times New Roman" w:hAnsi="Times New Roman" w:cs="Times New Roman"/>
+          <w:b/>
+          <w:bCs/>
+          <w:sz w:val="24"/>
+          <w:szCs w:val="24"/>
+          <w:lang w:eastAsia="en-IN"/>
+        </w:rPr>
+        <w:t>:</w:t>
+      </w:r>
+      <w:proofErr w:type="gramEnd"/>
       <w:r>
         <w:rPr>
           <w:rFonts w:ascii="Times New Roman" w:eastAsia="Times New Roman" w:hAnsi="Times New Roman" w:cs="Times New Roman"/>
@@ -7314,8 +8852,21 @@
           <w:szCs w:val="24"/>
           <w:lang w:eastAsia="en-IN"/>
         </w:rPr>
-        <w:t>Answer:</w:t>
-      </w:r>
+        <w:t>Answer</w:t>
+      </w:r>
+      <w:proofErr w:type="gramStart"/>
+      <w:r>
+        <w:rPr>
+          <w:rFonts w:ascii="Times New Roman" w:eastAsia="Times New Roman" w:hAnsi="Times New Roman" w:cs="Times New Roman"/>
+          <w:b/>
+          <w:bCs/>
+          <w:sz w:val="24"/>
+          <w:szCs w:val="24"/>
+          <w:lang w:eastAsia="en-IN"/>
+        </w:rPr>
+        <w:t>:</w:t>
+      </w:r>
+      <w:proofErr w:type="gramEnd"/>
       <w:r>
         <w:rPr>
           <w:rFonts w:ascii="Times New Roman" w:eastAsia="Times New Roman" w:hAnsi="Times New Roman" w:cs="Times New Roman"/>
@@ -7357,44 +8908,70 @@
           <w:rFonts w:ascii="Times New Roman" w:eastAsia="Times New Roman" w:hAnsi="Times New Roman" w:cs="Times New Roman"/>
           <w:b/>
           <w:bCs/>
-          <w:sz w:val="27"/>
-          <w:szCs w:val="27"/>
-          <w:lang w:eastAsia="en-IN"/>
-        </w:rPr>
-      </w:pPr>
-      <w:r>
-        <w:rPr>
-          <w:rFonts w:ascii="Times New Roman" w:eastAsia="Times New Roman" w:hAnsi="Times New Roman" w:cs="Times New Roman"/>
-          <w:b/>
-          <w:bCs/>
-          <w:sz w:val="27"/>
-          <w:szCs w:val="27"/>
-          <w:lang w:eastAsia="en-IN"/>
-        </w:rPr>
-        <w:t>Q85. Why does COUNT(*) still scan table?</w:t>
-      </w:r>
-    </w:p>
-    <w:p>
-      <w:pPr>
-        <w:spacing w:before="100" w:beforeAutospacing="1" w:after="100" w:afterAutospacing="1" w:line="240" w:lineRule="auto"/>
-        <w:rPr>
-          <w:rFonts w:ascii="Times New Roman" w:eastAsia="Times New Roman" w:hAnsi="Times New Roman" w:cs="Times New Roman"/>
-          <w:sz w:val="24"/>
-          <w:szCs w:val="24"/>
-          <w:lang w:eastAsia="en-IN"/>
-        </w:rPr>
-      </w:pPr>
-      <w:r>
-        <w:rPr>
-          <w:rFonts w:ascii="Times New Roman" w:eastAsia="Times New Roman" w:hAnsi="Times New Roman" w:cs="Times New Roman"/>
-          <w:b/>
-          <w:bCs/>
-          <w:sz w:val="24"/>
-          <w:szCs w:val="24"/>
-          <w:lang w:eastAsia="en-IN"/>
-        </w:rPr>
-        <w:t>Answer:</w:t>
-      </w:r>
+          <w:noProof/>
+          <w:sz w:val="27"/>
+          <w:szCs w:val="27"/>
+          <w:lang w:eastAsia="en-IN"/>
+        </w:rPr>
+      </w:pPr>
+      <w:r>
+        <w:rPr>
+          <w:rFonts w:ascii="Times New Roman" w:eastAsia="Times New Roman" w:hAnsi="Times New Roman" w:cs="Times New Roman"/>
+          <w:b/>
+          <w:bCs/>
+          <w:sz w:val="27"/>
+          <w:szCs w:val="27"/>
+          <w:lang w:eastAsia="en-IN"/>
+        </w:rPr>
+        <w:t xml:space="preserve">Q85. </w:t>
+      </w:r>
+      <w:r>
+        <w:rPr>
+          <w:rFonts w:ascii="Times New Roman" w:eastAsia="Times New Roman" w:hAnsi="Times New Roman" w:cs="Times New Roman"/>
+          <w:b/>
+          <w:bCs/>
+          <w:noProof/>
+          <w:sz w:val="27"/>
+          <w:szCs w:val="27"/>
+          <w:lang w:eastAsia="en-IN"/>
+        </w:rPr>
+        <w:t>Why does COUNT(*) still scan table?</w:t>
+      </w:r>
+    </w:p>
+    <w:p>
+      <w:pPr>
+        <w:spacing w:before="100" w:beforeAutospacing="1" w:after="100" w:afterAutospacing="1" w:line="240" w:lineRule="auto"/>
+        <w:rPr>
+          <w:rFonts w:ascii="Times New Roman" w:eastAsia="Times New Roman" w:hAnsi="Times New Roman" w:cs="Times New Roman"/>
+          <w:sz w:val="24"/>
+          <w:szCs w:val="24"/>
+          <w:lang w:eastAsia="en-IN"/>
+        </w:rPr>
+      </w:pPr>
+      <w:r>
+        <w:rPr>
+          <w:rFonts w:ascii="Times New Roman" w:eastAsia="Times New Roman" w:hAnsi="Times New Roman" w:cs="Times New Roman"/>
+          <w:b/>
+          <w:bCs/>
+          <w:sz w:val="24"/>
+          <w:szCs w:val="24"/>
+          <w:lang w:eastAsia="en-IN"/>
+        </w:rPr>
+        <w:t>Answer</w:t>
+      </w:r>
+      <w:proofErr w:type="gramStart"/>
+      <w:r>
+        <w:rPr>
+          <w:rFonts w:ascii="Times New Roman" w:eastAsia="Times New Roman" w:hAnsi="Times New Roman" w:cs="Times New Roman"/>
+          <w:b/>
+          <w:bCs/>
+          <w:sz w:val="24"/>
+          <w:szCs w:val="24"/>
+          <w:lang w:eastAsia="en-IN"/>
+        </w:rPr>
+        <w:t>:</w:t>
+      </w:r>
+      <w:proofErr w:type="gramEnd"/>
       <w:r>
         <w:rPr>
           <w:rFonts w:ascii="Times New Roman" w:eastAsia="Times New Roman" w:hAnsi="Times New Roman" w:cs="Times New Roman"/>
@@ -7472,8 +9049,21 @@
           <w:szCs w:val="24"/>
           <w:lang w:eastAsia="en-IN"/>
         </w:rPr>
-        <w:t>Answer:</w:t>
-      </w:r>
+        <w:t>Answer</w:t>
+      </w:r>
+      <w:proofErr w:type="gramStart"/>
+      <w:r>
+        <w:rPr>
+          <w:rFonts w:ascii="Times New Roman" w:eastAsia="Times New Roman" w:hAnsi="Times New Roman" w:cs="Times New Roman"/>
+          <w:b/>
+          <w:bCs/>
+          <w:sz w:val="24"/>
+          <w:szCs w:val="24"/>
+          <w:lang w:eastAsia="en-IN"/>
+        </w:rPr>
+        <w:t>:</w:t>
+      </w:r>
+      <w:proofErr w:type="gramEnd"/>
       <w:r>
         <w:rPr>
           <w:rFonts w:ascii="Times New Roman" w:eastAsia="Times New Roman" w:hAnsi="Times New Roman" w:cs="Times New Roman"/>
@@ -7552,8 +9142,21 @@
           <w:szCs w:val="24"/>
           <w:lang w:eastAsia="en-IN"/>
         </w:rPr>
-        <w:t>Answer:</w:t>
-      </w:r>
+        <w:t>Answer</w:t>
+      </w:r>
+      <w:proofErr w:type="gramStart"/>
+      <w:r>
+        <w:rPr>
+          <w:rFonts w:ascii="Times New Roman" w:eastAsia="Times New Roman" w:hAnsi="Times New Roman" w:cs="Times New Roman"/>
+          <w:b/>
+          <w:bCs/>
+          <w:sz w:val="24"/>
+          <w:szCs w:val="24"/>
+          <w:lang w:eastAsia="en-IN"/>
+        </w:rPr>
+        <w:t>:</w:t>
+      </w:r>
+      <w:proofErr w:type="gramEnd"/>
       <w:r>
         <w:rPr>
           <w:rFonts w:ascii="Times New Roman" w:eastAsia="Times New Roman" w:hAnsi="Times New Roman" w:cs="Times New Roman"/>
@@ -7631,8 +9234,21 @@
           <w:szCs w:val="24"/>
           <w:lang w:eastAsia="en-IN"/>
         </w:rPr>
-        <w:t>Answer:</w:t>
-      </w:r>
+        <w:t>Answer</w:t>
+      </w:r>
+      <w:proofErr w:type="gramStart"/>
+      <w:r>
+        <w:rPr>
+          <w:rFonts w:ascii="Times New Roman" w:eastAsia="Times New Roman" w:hAnsi="Times New Roman" w:cs="Times New Roman"/>
+          <w:b/>
+          <w:bCs/>
+          <w:sz w:val="24"/>
+          <w:szCs w:val="24"/>
+          <w:lang w:eastAsia="en-IN"/>
+        </w:rPr>
+        <w:t>:</w:t>
+      </w:r>
+      <w:proofErr w:type="gramEnd"/>
       <w:r>
         <w:rPr>
           <w:rFonts w:ascii="Times New Roman" w:eastAsia="Times New Roman" w:hAnsi="Times New Roman" w:cs="Times New Roman"/>
@@ -7710,8 +9326,21 @@
           <w:szCs w:val="24"/>
           <w:lang w:eastAsia="en-IN"/>
         </w:rPr>
-        <w:t>Answer:</w:t>
-      </w:r>
+        <w:t>Answer</w:t>
+      </w:r>
+      <w:proofErr w:type="gramStart"/>
+      <w:r>
+        <w:rPr>
+          <w:rFonts w:ascii="Times New Roman" w:eastAsia="Times New Roman" w:hAnsi="Times New Roman" w:cs="Times New Roman"/>
+          <w:b/>
+          <w:bCs/>
+          <w:sz w:val="24"/>
+          <w:szCs w:val="24"/>
+          <w:lang w:eastAsia="en-IN"/>
+        </w:rPr>
+        <w:t>:</w:t>
+      </w:r>
+      <w:proofErr w:type="gramEnd"/>
       <w:r>
         <w:rPr>
           <w:rFonts w:ascii="Times New Roman" w:eastAsia="Times New Roman" w:hAnsi="Times New Roman" w:cs="Times New Roman"/>
@@ -7789,8 +9418,21 @@
           <w:szCs w:val="24"/>
           <w:lang w:eastAsia="en-IN"/>
         </w:rPr>
-        <w:t>Answer:</w:t>
-      </w:r>
+        <w:t>Answer</w:t>
+      </w:r>
+      <w:proofErr w:type="gramStart"/>
+      <w:r>
+        <w:rPr>
+          <w:rFonts w:ascii="Times New Roman" w:eastAsia="Times New Roman" w:hAnsi="Times New Roman" w:cs="Times New Roman"/>
+          <w:b/>
+          <w:bCs/>
+          <w:sz w:val="24"/>
+          <w:szCs w:val="24"/>
+          <w:lang w:eastAsia="en-IN"/>
+        </w:rPr>
+        <w:t>:</w:t>
+      </w:r>
+      <w:proofErr w:type="gramEnd"/>
       <w:r>
         <w:rPr>
           <w:rFonts w:ascii="Times New Roman" w:eastAsia="Times New Roman" w:hAnsi="Times New Roman" w:cs="Times New Roman"/>
@@ -7846,30 +9488,67 @@
           <w:szCs w:val="27"/>
           <w:lang w:eastAsia="en-IN"/>
         </w:rPr>
-        <w:t>Q91. Why does AVG(salary) differ from SUM/COUNT?</w:t>
-      </w:r>
-    </w:p>
-    <w:p>
-      <w:pPr>
-        <w:spacing w:before="100" w:beforeAutospacing="1" w:after="100" w:afterAutospacing="1" w:line="240" w:lineRule="auto"/>
-        <w:rPr>
-          <w:rFonts w:ascii="Times New Roman" w:eastAsia="Times New Roman" w:hAnsi="Times New Roman" w:cs="Times New Roman"/>
-          <w:sz w:val="24"/>
-          <w:szCs w:val="24"/>
-          <w:lang w:eastAsia="en-IN"/>
-        </w:rPr>
-      </w:pPr>
-      <w:r>
-        <w:rPr>
-          <w:rFonts w:ascii="Times New Roman" w:eastAsia="Times New Roman" w:hAnsi="Times New Roman" w:cs="Times New Roman"/>
-          <w:b/>
-          <w:bCs/>
-          <w:sz w:val="24"/>
-          <w:szCs w:val="24"/>
-          <w:lang w:eastAsia="en-IN"/>
-        </w:rPr>
-        <w:t>Answer:</w:t>
-      </w:r>
+        <w:t xml:space="preserve">Q91. Why does </w:t>
+      </w:r>
+      <w:proofErr w:type="gramStart"/>
+      <w:r>
+        <w:rPr>
+          <w:rFonts w:ascii="Times New Roman" w:eastAsia="Times New Roman" w:hAnsi="Times New Roman" w:cs="Times New Roman"/>
+          <w:b/>
+          <w:bCs/>
+          <w:sz w:val="27"/>
+          <w:szCs w:val="27"/>
+          <w:lang w:eastAsia="en-IN"/>
+        </w:rPr>
+        <w:t>AVG(</w:t>
+      </w:r>
+      <w:proofErr w:type="gramEnd"/>
+      <w:r>
+        <w:rPr>
+          <w:rFonts w:ascii="Times New Roman" w:eastAsia="Times New Roman" w:hAnsi="Times New Roman" w:cs="Times New Roman"/>
+          <w:b/>
+          <w:bCs/>
+          <w:sz w:val="27"/>
+          <w:szCs w:val="27"/>
+          <w:lang w:eastAsia="en-IN"/>
+        </w:rPr>
+        <w:t>salary) differ from SUM/COUNT?</w:t>
+      </w:r>
+    </w:p>
+    <w:p>
+      <w:pPr>
+        <w:spacing w:before="100" w:beforeAutospacing="1" w:after="100" w:afterAutospacing="1" w:line="240" w:lineRule="auto"/>
+        <w:rPr>
+          <w:rFonts w:ascii="Times New Roman" w:eastAsia="Times New Roman" w:hAnsi="Times New Roman" w:cs="Times New Roman"/>
+          <w:sz w:val="24"/>
+          <w:szCs w:val="24"/>
+          <w:lang w:eastAsia="en-IN"/>
+        </w:rPr>
+      </w:pPr>
+      <w:r>
+        <w:rPr>
+          <w:rFonts w:ascii="Times New Roman" w:eastAsia="Times New Roman" w:hAnsi="Times New Roman" w:cs="Times New Roman"/>
+          <w:b/>
+          <w:bCs/>
+          <w:sz w:val="24"/>
+          <w:szCs w:val="24"/>
+          <w:lang w:eastAsia="en-IN"/>
+        </w:rPr>
+        <w:t>Answer</w:t>
+      </w:r>
+      <w:proofErr w:type="gramStart"/>
+      <w:r>
+        <w:rPr>
+          <w:rFonts w:ascii="Times New Roman" w:eastAsia="Times New Roman" w:hAnsi="Times New Roman" w:cs="Times New Roman"/>
+          <w:b/>
+          <w:bCs/>
+          <w:sz w:val="24"/>
+          <w:szCs w:val="24"/>
+          <w:lang w:eastAsia="en-IN"/>
+        </w:rPr>
+        <w:t>:</w:t>
+      </w:r>
+      <w:proofErr w:type="gramEnd"/>
       <w:r>
         <w:rPr>
           <w:rFonts w:ascii="Times New Roman" w:eastAsia="Times New Roman" w:hAnsi="Times New Roman" w:cs="Times New Roman"/>
@@ -7947,8 +9626,21 @@
           <w:szCs w:val="24"/>
           <w:lang w:eastAsia="en-IN"/>
         </w:rPr>
-        <w:t>Answer:</w:t>
-      </w:r>
+        <w:t>Answer</w:t>
+      </w:r>
+      <w:proofErr w:type="gramStart"/>
+      <w:r>
+        <w:rPr>
+          <w:rFonts w:ascii="Times New Roman" w:eastAsia="Times New Roman" w:hAnsi="Times New Roman" w:cs="Times New Roman"/>
+          <w:b/>
+          <w:bCs/>
+          <w:sz w:val="24"/>
+          <w:szCs w:val="24"/>
+          <w:lang w:eastAsia="en-IN"/>
+        </w:rPr>
+        <w:t>:</w:t>
+      </w:r>
+      <w:proofErr w:type="gramEnd"/>
       <w:r>
         <w:rPr>
           <w:rFonts w:ascii="Times New Roman" w:eastAsia="Times New Roman" w:hAnsi="Times New Roman" w:cs="Times New Roman"/>
@@ -8026,8 +9718,21 @@
           <w:szCs w:val="24"/>
           <w:lang w:eastAsia="en-IN"/>
         </w:rPr>
-        <w:t>Answer:</w:t>
-      </w:r>
+        <w:t>Answer</w:t>
+      </w:r>
+      <w:proofErr w:type="gramStart"/>
+      <w:r>
+        <w:rPr>
+          <w:rFonts w:ascii="Times New Roman" w:eastAsia="Times New Roman" w:hAnsi="Times New Roman" w:cs="Times New Roman"/>
+          <w:b/>
+          <w:bCs/>
+          <w:sz w:val="24"/>
+          <w:szCs w:val="24"/>
+          <w:lang w:eastAsia="en-IN"/>
+        </w:rPr>
+        <w:t>:</w:t>
+      </w:r>
+      <w:proofErr w:type="gramEnd"/>
       <w:r>
         <w:rPr>
           <w:rFonts w:ascii="Times New Roman" w:eastAsia="Times New Roman" w:hAnsi="Times New Roman" w:cs="Times New Roman"/>
@@ -8106,8 +9811,21 @@
           <w:szCs w:val="24"/>
           <w:lang w:eastAsia="en-IN"/>
         </w:rPr>
-        <w:t>Answer:</w:t>
-      </w:r>
+        <w:t>Answer</w:t>
+      </w:r>
+      <w:proofErr w:type="gramStart"/>
+      <w:r>
+        <w:rPr>
+          <w:rFonts w:ascii="Times New Roman" w:eastAsia="Times New Roman" w:hAnsi="Times New Roman" w:cs="Times New Roman"/>
+          <w:b/>
+          <w:bCs/>
+          <w:sz w:val="24"/>
+          <w:szCs w:val="24"/>
+          <w:lang w:eastAsia="en-IN"/>
+        </w:rPr>
+        <w:t>:</w:t>
+      </w:r>
+      <w:proofErr w:type="gramEnd"/>
       <w:r>
         <w:rPr>
           <w:rFonts w:ascii="Times New Roman" w:eastAsia="Times New Roman" w:hAnsi="Times New Roman" w:cs="Times New Roman"/>
@@ -8185,8 +9903,21 @@
           <w:szCs w:val="24"/>
           <w:lang w:eastAsia="en-IN"/>
         </w:rPr>
-        <w:t>Answer:</w:t>
-      </w:r>
+        <w:t>Answer</w:t>
+      </w:r>
+      <w:proofErr w:type="gramStart"/>
+      <w:r>
+        <w:rPr>
+          <w:rFonts w:ascii="Times New Roman" w:eastAsia="Times New Roman" w:hAnsi="Times New Roman" w:cs="Times New Roman"/>
+          <w:b/>
+          <w:bCs/>
+          <w:sz w:val="24"/>
+          <w:szCs w:val="24"/>
+          <w:lang w:eastAsia="en-IN"/>
+        </w:rPr>
+        <w:t>:</w:t>
+      </w:r>
+      <w:proofErr w:type="gramEnd"/>
       <w:r>
         <w:rPr>
           <w:rFonts w:ascii="Times New Roman" w:eastAsia="Times New Roman" w:hAnsi="Times New Roman" w:cs="Times New Roman"/>
@@ -8264,8 +9995,21 @@
           <w:szCs w:val="24"/>
           <w:lang w:eastAsia="en-IN"/>
         </w:rPr>
-        <w:t>Answer:</w:t>
-      </w:r>
+        <w:t>Answer</w:t>
+      </w:r>
+      <w:proofErr w:type="gramStart"/>
+      <w:r>
+        <w:rPr>
+          <w:rFonts w:ascii="Times New Roman" w:eastAsia="Times New Roman" w:hAnsi="Times New Roman" w:cs="Times New Roman"/>
+          <w:b/>
+          <w:bCs/>
+          <w:sz w:val="24"/>
+          <w:szCs w:val="24"/>
+          <w:lang w:eastAsia="en-IN"/>
+        </w:rPr>
+        <w:t>:</w:t>
+      </w:r>
+      <w:proofErr w:type="gramEnd"/>
       <w:r>
         <w:rPr>
           <w:rFonts w:ascii="Times New Roman" w:eastAsia="Times New Roman" w:hAnsi="Times New Roman" w:cs="Times New Roman"/>
@@ -8343,8 +10087,21 @@
           <w:szCs w:val="24"/>
           <w:lang w:eastAsia="en-IN"/>
         </w:rPr>
-        <w:t>Answer:</w:t>
-      </w:r>
+        <w:t>Answer</w:t>
+      </w:r>
+      <w:proofErr w:type="gramStart"/>
+      <w:r>
+        <w:rPr>
+          <w:rFonts w:ascii="Times New Roman" w:eastAsia="Times New Roman" w:hAnsi="Times New Roman" w:cs="Times New Roman"/>
+          <w:b/>
+          <w:bCs/>
+          <w:sz w:val="24"/>
+          <w:szCs w:val="24"/>
+          <w:lang w:eastAsia="en-IN"/>
+        </w:rPr>
+        <w:t>:</w:t>
+      </w:r>
+      <w:proofErr w:type="gramEnd"/>
       <w:r>
         <w:rPr>
           <w:rFonts w:ascii="Times New Roman" w:eastAsia="Times New Roman" w:hAnsi="Times New Roman" w:cs="Times New Roman"/>
@@ -8422,8 +10179,21 @@
           <w:szCs w:val="24"/>
           <w:lang w:eastAsia="en-IN"/>
         </w:rPr>
-        <w:t>Answer:</w:t>
-      </w:r>
+        <w:t>Answer</w:t>
+      </w:r>
+      <w:proofErr w:type="gramStart"/>
+      <w:r>
+        <w:rPr>
+          <w:rFonts w:ascii="Times New Roman" w:eastAsia="Times New Roman" w:hAnsi="Times New Roman" w:cs="Times New Roman"/>
+          <w:b/>
+          <w:bCs/>
+          <w:sz w:val="24"/>
+          <w:szCs w:val="24"/>
+          <w:lang w:eastAsia="en-IN"/>
+        </w:rPr>
+        <w:t>:</w:t>
+      </w:r>
+      <w:proofErr w:type="gramEnd"/>
       <w:r>
         <w:rPr>
           <w:rFonts w:ascii="Times New Roman" w:eastAsia="Times New Roman" w:hAnsi="Times New Roman" w:cs="Times New Roman"/>
@@ -8501,8 +10271,21 @@
           <w:szCs w:val="24"/>
           <w:lang w:eastAsia="en-IN"/>
         </w:rPr>
-        <w:t>Answer:</w:t>
-      </w:r>
+        <w:t>Answer</w:t>
+      </w:r>
+      <w:proofErr w:type="gramStart"/>
+      <w:r>
+        <w:rPr>
+          <w:rFonts w:ascii="Times New Roman" w:eastAsia="Times New Roman" w:hAnsi="Times New Roman" w:cs="Times New Roman"/>
+          <w:b/>
+          <w:bCs/>
+          <w:sz w:val="24"/>
+          <w:szCs w:val="24"/>
+          <w:lang w:eastAsia="en-IN"/>
+        </w:rPr>
+        <w:t>:</w:t>
+      </w:r>
+      <w:proofErr w:type="gramEnd"/>
       <w:r>
         <w:rPr>
           <w:rFonts w:ascii="Times New Roman" w:eastAsia="Times New Roman" w:hAnsi="Times New Roman" w:cs="Times New Roman"/>
@@ -8580,8 +10363,21 @@
           <w:szCs w:val="24"/>
           <w:lang w:eastAsia="en-IN"/>
         </w:rPr>
-        <w:t>Answer:</w:t>
-      </w:r>
+        <w:t>Answer</w:t>
+      </w:r>
+      <w:proofErr w:type="gramStart"/>
+      <w:r>
+        <w:rPr>
+          <w:rFonts w:ascii="Times New Roman" w:eastAsia="Times New Roman" w:hAnsi="Times New Roman" w:cs="Times New Roman"/>
+          <w:b/>
+          <w:bCs/>
+          <w:sz w:val="24"/>
+          <w:szCs w:val="24"/>
+          <w:lang w:eastAsia="en-IN"/>
+        </w:rPr>
+        <w:t>:</w:t>
+      </w:r>
+      <w:proofErr w:type="gramEnd"/>
       <w:r>
         <w:rPr>
           <w:rFonts w:ascii="Times New Roman" w:eastAsia="Times New Roman" w:hAnsi="Times New Roman" w:cs="Times New Roman"/>
@@ -8653,10 +10449,7 @@
         <w:t>, not just keywords.</w:t>
       </w:r>
     </w:p>
-    <w:p>
-      <w:bookmarkStart w:id="0" w:name="_GoBack"/>
-      <w:bookmarkEnd w:id="0"/>
-    </w:p>
+    <w:p/>
     <w:sectPr>
       <w:pgSz w:w="11906" w:h="16838"/>
       <w:pgMar w:top="1440" w:right="1440" w:bottom="1440" w:left="1440" w:header="708" w:footer="708" w:gutter="0"/>

</xml_diff>